<commit_message>
MedJarvis V1 - presentation safe
</commit_message>
<xml_diff>
--- a/Temp_Reference/Updated_MedJarvis_Plan.docx
+++ b/Temp_Reference/Updated_MedJarvis_Plan.docx
@@ -285,7 +285,7 @@
           <w:rFonts w:ascii="Times New Roman" w:hAnsi="Times New Roman" w:cs="Times New Roman"/>
         </w:rPr>
         <w:pict w14:anchorId="49FD4023">
-          <v:rect id="_x0000_i1343" style="width:0;height:1.5pt" o:hralign="center" o:hrstd="t" o:hr="t" fillcolor="#a0a0a0" stroked="f"/>
+          <v:rect id="_x0000_i1025" style="width:0;height:1.5pt" o:hralign="center" o:hrstd="t" o:hr="t" fillcolor="#a0a0a0" stroked="f"/>
         </w:pict>
       </w:r>
     </w:p>
@@ -716,7 +716,7 @@
         </w:rPr>
         <w:lastRenderedPageBreak/>
         <w:pict w14:anchorId="13926991">
-          <v:rect id="_x0000_i1344" style="width:0;height:1.5pt" o:hralign="center" o:hrstd="t" o:hr="t" fillcolor="#a0a0a0" stroked="f"/>
+          <v:rect id="_x0000_i1026" style="width:0;height:1.5pt" o:hralign="center" o:hrstd="t" o:hr="t" fillcolor="#a0a0a0" stroked="f"/>
         </w:pict>
       </w:r>
     </w:p>
@@ -1235,7 +1235,7 @@
           <w:rFonts w:ascii="Times New Roman" w:hAnsi="Times New Roman" w:cs="Times New Roman"/>
         </w:rPr>
         <w:pict w14:anchorId="72E893E6">
-          <v:rect id="_x0000_i1345" style="width:0;height:1.5pt" o:hralign="center" o:hrstd="t" o:hr="t" fillcolor="#a0a0a0" stroked="f"/>
+          <v:rect id="_x0000_i1027" style="width:0;height:1.5pt" o:hralign="center" o:hrstd="t" o:hr="t" fillcolor="#a0a0a0" stroked="f"/>
         </w:pict>
       </w:r>
     </w:p>
@@ -1759,7 +1759,7 @@
           <w:rFonts w:ascii="Times New Roman" w:hAnsi="Times New Roman" w:cs="Times New Roman"/>
         </w:rPr>
         <w:pict w14:anchorId="5F7ECF8C">
-          <v:rect id="_x0000_i1346" style="width:0;height:1.5pt" o:hralign="center" o:hrstd="t" o:hr="t" fillcolor="#a0a0a0" stroked="f"/>
+          <v:rect id="_x0000_i1028" style="width:0;height:1.5pt" o:hralign="center" o:hrstd="t" o:hr="t" fillcolor="#a0a0a0" stroked="f"/>
         </w:pict>
       </w:r>
     </w:p>
@@ -1996,7 +1996,7 @@
           <w:rFonts w:ascii="Times New Roman" w:hAnsi="Times New Roman" w:cs="Times New Roman"/>
         </w:rPr>
         <w:pict w14:anchorId="1EED0467">
-          <v:rect id="_x0000_i1347" style="width:0;height:1.5pt" o:hralign="center" o:hrstd="t" o:hr="t" fillcolor="#a0a0a0" stroked="f"/>
+          <v:rect id="_x0000_i1029" style="width:0;height:1.5pt" o:hralign="center" o:hrstd="t" o:hr="t" fillcolor="#a0a0a0" stroked="f"/>
         </w:pict>
       </w:r>
     </w:p>
@@ -2268,7 +2268,7 @@
           <w:rFonts w:ascii="Times New Roman" w:hAnsi="Times New Roman" w:cs="Times New Roman"/>
         </w:rPr>
         <w:pict w14:anchorId="05CEB565">
-          <v:rect id="_x0000_i1348" style="width:0;height:1.5pt" o:hralign="center" o:hrstd="t" o:hr="t" fillcolor="#a0a0a0" stroked="f"/>
+          <v:rect id="_x0000_i1030" style="width:0;height:1.5pt" o:hralign="center" o:hrstd="t" o:hr="t" fillcolor="#a0a0a0" stroked="f"/>
         </w:pict>
       </w:r>
     </w:p>
@@ -2811,7 +2811,7 @@
           <w:rFonts w:ascii="Times New Roman" w:hAnsi="Times New Roman" w:cs="Times New Roman"/>
         </w:rPr>
         <w:pict w14:anchorId="66118C3A">
-          <v:rect id="_x0000_i1349" style="width:0;height:1.5pt" o:hralign="center" o:hrstd="t" o:hr="t" fillcolor="#a0a0a0" stroked="f"/>
+          <v:rect id="_x0000_i1031" style="width:0;height:1.5pt" o:hralign="center" o:hrstd="t" o:hr="t" fillcolor="#a0a0a0" stroked="f"/>
         </w:pict>
       </w:r>
     </w:p>
@@ -2980,7 +2980,7 @@
           <w:rFonts w:ascii="Times New Roman" w:hAnsi="Times New Roman" w:cs="Times New Roman"/>
         </w:rPr>
         <w:pict w14:anchorId="4A3D712D">
-          <v:rect id="_x0000_i1350" style="width:0;height:1.5pt" o:hralign="center" o:hrstd="t" o:hr="t" fillcolor="#a0a0a0" stroked="f"/>
+          <v:rect id="_x0000_i1032" style="width:0;height:1.5pt" o:hralign="center" o:hrstd="t" o:hr="t" fillcolor="#a0a0a0" stroked="f"/>
         </w:pict>
       </w:r>
     </w:p>
@@ -3269,7 +3269,7 @@
           <w:rFonts w:ascii="Times New Roman" w:hAnsi="Times New Roman" w:cs="Times New Roman"/>
         </w:rPr>
         <w:pict w14:anchorId="322B989A">
-          <v:rect id="_x0000_i1351" style="width:0;height:1.5pt" o:hralign="center" o:hrstd="t" o:hr="t" fillcolor="#a0a0a0" stroked="f"/>
+          <v:rect id="_x0000_i1033" style="width:0;height:1.5pt" o:hralign="center" o:hrstd="t" o:hr="t" fillcolor="#a0a0a0" stroked="f"/>
         </w:pict>
       </w:r>
     </w:p>
@@ -3563,7 +3563,7 @@
           <w:rFonts w:ascii="Times New Roman" w:hAnsi="Times New Roman" w:cs="Times New Roman"/>
         </w:rPr>
         <w:pict w14:anchorId="4D8A09D6">
-          <v:rect id="_x0000_i1352" style="width:0;height:1.5pt" o:hralign="center" o:hrstd="t" o:hr="t" fillcolor="#a0a0a0" stroked="f"/>
+          <v:rect id="_x0000_i1034" style="width:0;height:1.5pt" o:hralign="center" o:hrstd="t" o:hr="t" fillcolor="#a0a0a0" stroked="f"/>
         </w:pict>
       </w:r>
     </w:p>
@@ -3848,7 +3848,7 @@
           <w:rFonts w:ascii="Times New Roman" w:hAnsi="Times New Roman" w:cs="Times New Roman"/>
         </w:rPr>
         <w:pict w14:anchorId="43A831EE">
-          <v:rect id="_x0000_i1353" style="width:0;height:1.5pt" o:hralign="center" o:hrstd="t" o:hr="t" fillcolor="#a0a0a0" stroked="f"/>
+          <v:rect id="_x0000_i1035" style="width:0;height:1.5pt" o:hralign="center" o:hrstd="t" o:hr="t" fillcolor="#a0a0a0" stroked="f"/>
         </w:pict>
       </w:r>
     </w:p>
@@ -4100,7 +4100,7 @@
           <w:rFonts w:ascii="Times New Roman" w:hAnsi="Times New Roman" w:cs="Times New Roman"/>
         </w:rPr>
         <w:pict w14:anchorId="2690537A">
-          <v:rect id="_x0000_i1354" style="width:0;height:1.5pt" o:hralign="center" o:hrstd="t" o:hr="t" fillcolor="#a0a0a0" stroked="f"/>
+          <v:rect id="_x0000_i1036" style="width:0;height:1.5pt" o:hralign="center" o:hrstd="t" o:hr="t" fillcolor="#a0a0a0" stroked="f"/>
         </w:pict>
       </w:r>
     </w:p>
@@ -4443,7 +4443,7 @@
           <w:rFonts w:ascii="Times New Roman" w:hAnsi="Times New Roman" w:cs="Times New Roman"/>
         </w:rPr>
         <w:pict w14:anchorId="09DF24E6">
-          <v:rect id="_x0000_i1355" style="width:0;height:1.5pt" o:hralign="center" o:hrstd="t" o:hr="t" fillcolor="#a0a0a0" stroked="f"/>
+          <v:rect id="_x0000_i1037" style="width:0;height:1.5pt" o:hralign="center" o:hrstd="t" o:hr="t" fillcolor="#a0a0a0" stroked="f"/>
         </w:pict>
       </w:r>
     </w:p>
@@ -4650,7 +4650,7 @@
           <w:rFonts w:ascii="Times New Roman" w:hAnsi="Times New Roman" w:cs="Times New Roman"/>
         </w:rPr>
         <w:pict w14:anchorId="50973A29">
-          <v:rect id="_x0000_i1356" style="width:0;height:1.5pt" o:hralign="center" o:hrstd="t" o:hr="t" fillcolor="#a0a0a0" stroked="f"/>
+          <v:rect id="_x0000_i1038" style="width:0;height:1.5pt" o:hralign="center" o:hrstd="t" o:hr="t" fillcolor="#a0a0a0" stroked="f"/>
         </w:pict>
       </w:r>
     </w:p>
@@ -5014,7 +5014,7 @@
           <w:rFonts w:ascii="Times New Roman" w:hAnsi="Times New Roman" w:cs="Times New Roman"/>
         </w:rPr>
         <w:pict w14:anchorId="549F0FFC">
-          <v:rect id="_x0000_i1357" style="width:0;height:1.5pt" o:hralign="center" o:hrstd="t" o:hr="t" fillcolor="#a0a0a0" stroked="f"/>
+          <v:rect id="_x0000_i1039" style="width:0;height:1.5pt" o:hralign="center" o:hrstd="t" o:hr="t" fillcolor="#a0a0a0" stroked="f"/>
         </w:pict>
       </w:r>
     </w:p>
@@ -5204,7 +5204,7 @@
           <w:rFonts w:ascii="Times New Roman" w:hAnsi="Times New Roman" w:cs="Times New Roman"/>
         </w:rPr>
         <w:pict w14:anchorId="75350F42">
-          <v:rect id="_x0000_i1358" style="width:0;height:1.5pt" o:hralign="center" o:hrstd="t" o:hr="t" fillcolor="#a0a0a0" stroked="f"/>
+          <v:rect id="_x0000_i1040" style="width:0;height:1.5pt" o:hralign="center" o:hrstd="t" o:hr="t" fillcolor="#a0a0a0" stroked="f"/>
         </w:pict>
       </w:r>
     </w:p>
@@ -5471,7 +5471,7 @@
           <w:rFonts w:ascii="Times New Roman" w:hAnsi="Times New Roman" w:cs="Times New Roman"/>
         </w:rPr>
         <w:pict w14:anchorId="0F975994">
-          <v:rect id="_x0000_i1359" style="width:0;height:1.5pt" o:hralign="center" o:hrstd="t" o:hr="t" fillcolor="#a0a0a0" stroked="f"/>
+          <v:rect id="_x0000_i1041" style="width:0;height:1.5pt" o:hralign="center" o:hrstd="t" o:hr="t" fillcolor="#a0a0a0" stroked="f"/>
         </w:pict>
       </w:r>
     </w:p>
@@ -5698,7 +5698,7 @@
           <w:rFonts w:ascii="Times New Roman" w:hAnsi="Times New Roman" w:cs="Times New Roman"/>
         </w:rPr>
         <w:pict w14:anchorId="3C544D52">
-          <v:rect id="_x0000_i1360" style="width:0;height:1.5pt" o:hralign="center" o:hrstd="t" o:hr="t" fillcolor="#a0a0a0" stroked="f"/>
+          <v:rect id="_x0000_i1042" style="width:0;height:1.5pt" o:hralign="center" o:hrstd="t" o:hr="t" fillcolor="#a0a0a0" stroked="f"/>
         </w:pict>
       </w:r>
     </w:p>
@@ -6043,7 +6043,7 @@
           <w:rFonts w:ascii="Times New Roman" w:hAnsi="Times New Roman" w:cs="Times New Roman"/>
         </w:rPr>
         <w:pict w14:anchorId="0927125E">
-          <v:rect id="_x0000_i1361" style="width:0;height:1.5pt" o:hralign="center" o:hrstd="t" o:hr="t" fillcolor="#a0a0a0" stroked="f"/>
+          <v:rect id="_x0000_i1043" style="width:0;height:1.5pt" o:hralign="center" o:hrstd="t" o:hr="t" fillcolor="#a0a0a0" stroked="f"/>
         </w:pict>
       </w:r>
     </w:p>
@@ -6226,7 +6226,7 @@
           <w:rFonts w:ascii="Times New Roman" w:hAnsi="Times New Roman" w:cs="Times New Roman"/>
         </w:rPr>
         <w:pict w14:anchorId="3AF84FE1">
-          <v:rect id="_x0000_i1362" style="width:0;height:1.5pt" o:hralign="center" o:hrstd="t" o:hr="t" fillcolor="#a0a0a0" stroked="f"/>
+          <v:rect id="_x0000_i1044" style="width:0;height:1.5pt" o:hralign="center" o:hrstd="t" o:hr="t" fillcolor="#a0a0a0" stroked="f"/>
         </w:pict>
       </w:r>
     </w:p>
@@ -6751,7 +6751,7 @@
           <w:rFonts w:ascii="Times New Roman" w:hAnsi="Times New Roman" w:cs="Times New Roman"/>
         </w:rPr>
         <w:pict w14:anchorId="631D3943">
-          <v:rect id="_x0000_i1363" style="width:0;height:1.5pt" o:hralign="center" o:hrstd="t" o:hr="t" fillcolor="#a0a0a0" stroked="f"/>
+          <v:rect id="_x0000_i1045" style="width:0;height:1.5pt" o:hralign="center" o:hrstd="t" o:hr="t" fillcolor="#a0a0a0" stroked="f"/>
         </w:pict>
       </w:r>
     </w:p>
@@ -6998,7 +6998,7 @@
           <w:rFonts w:ascii="Times New Roman" w:hAnsi="Times New Roman" w:cs="Times New Roman"/>
         </w:rPr>
         <w:pict w14:anchorId="732AA6F6">
-          <v:rect id="_x0000_i1364" style="width:0;height:1.5pt" o:hralign="center" o:hrstd="t" o:hr="t" fillcolor="#a0a0a0" stroked="f"/>
+          <v:rect id="_x0000_i1046" style="width:0;height:1.5pt" o:hralign="center" o:hrstd="t" o:hr="t" fillcolor="#a0a0a0" stroked="f"/>
         </w:pict>
       </w:r>
     </w:p>
@@ -7184,7 +7184,7 @@
           <w:rFonts w:ascii="Times New Roman" w:hAnsi="Times New Roman" w:cs="Times New Roman"/>
         </w:rPr>
         <w:pict w14:anchorId="46543396">
-          <v:rect id="_x0000_i1365" style="width:0;height:1.5pt" o:hralign="center" o:hrstd="t" o:hr="t" fillcolor="#a0a0a0" stroked="f"/>
+          <v:rect id="_x0000_i1047" style="width:0;height:1.5pt" o:hralign="center" o:hrstd="t" o:hr="t" fillcolor="#a0a0a0" stroked="f"/>
         </w:pict>
       </w:r>
     </w:p>
@@ -7535,7 +7535,7 @@
           <w:rFonts w:ascii="Times New Roman" w:hAnsi="Times New Roman" w:cs="Times New Roman"/>
         </w:rPr>
         <w:pict w14:anchorId="274BE406">
-          <v:rect id="_x0000_i1366" style="width:0;height:1.5pt" o:hralign="center" o:hrstd="t" o:hr="t" fillcolor="#a0a0a0" stroked="f"/>
+          <v:rect id="_x0000_i1048" style="width:0;height:1.5pt" o:hralign="center" o:hrstd="t" o:hr="t" fillcolor="#a0a0a0" stroked="f"/>
         </w:pict>
       </w:r>
     </w:p>
@@ -7846,7 +7846,7 @@
           <w:rFonts w:ascii="Times New Roman" w:hAnsi="Times New Roman" w:cs="Times New Roman"/>
         </w:rPr>
         <w:pict w14:anchorId="25778E8D">
-          <v:rect id="_x0000_i1367" style="width:0;height:1.5pt" o:hralign="center" o:hrstd="t" o:hr="t" fillcolor="#a0a0a0" stroked="f"/>
+          <v:rect id="_x0000_i1049" style="width:0;height:1.5pt" o:hralign="center" o:hrstd="t" o:hr="t" fillcolor="#a0a0a0" stroked="f"/>
         </w:pict>
       </w:r>
     </w:p>
@@ -8055,7 +8055,7 @@
           <w:rFonts w:ascii="Times New Roman" w:hAnsi="Times New Roman" w:cs="Times New Roman"/>
         </w:rPr>
         <w:pict w14:anchorId="76A47EED">
-          <v:rect id="_x0000_i1368" style="width:0;height:1.5pt" o:hralign="center" o:hrstd="t" o:hr="t" fillcolor="#a0a0a0" stroked="f"/>
+          <v:rect id="_x0000_i1050" style="width:0;height:1.5pt" o:hralign="center" o:hrstd="t" o:hr="t" fillcolor="#a0a0a0" stroked="f"/>
         </w:pict>
       </w:r>
     </w:p>
@@ -8456,7 +8456,7 @@
           <w:rFonts w:ascii="Times New Roman" w:hAnsi="Times New Roman" w:cs="Times New Roman"/>
         </w:rPr>
         <w:pict w14:anchorId="1FA643C9">
-          <v:rect id="_x0000_i1369" style="width:0;height:1.5pt" o:hralign="center" o:hrstd="t" o:hr="t" fillcolor="#a0a0a0" stroked="f"/>
+          <v:rect id="_x0000_i1051" style="width:0;height:1.5pt" o:hralign="center" o:hrstd="t" o:hr="t" fillcolor="#a0a0a0" stroked="f"/>
         </w:pict>
       </w:r>
     </w:p>
@@ -9020,7 +9020,7 @@
           <w:rFonts w:ascii="Times New Roman" w:hAnsi="Times New Roman" w:cs="Times New Roman"/>
         </w:rPr>
         <w:pict w14:anchorId="488328E5">
-          <v:rect id="_x0000_i1370" style="width:0;height:1.5pt" o:hralign="center" o:hrstd="t" o:hr="t" fillcolor="#a0a0a0" stroked="f"/>
+          <v:rect id="_x0000_i1052" style="width:0;height:1.5pt" o:hralign="center" o:hrstd="t" o:hr="t" fillcolor="#a0a0a0" stroked="f"/>
         </w:pict>
       </w:r>
     </w:p>
@@ -9478,7 +9478,7 @@
           <w:rFonts w:ascii="Times New Roman" w:hAnsi="Times New Roman" w:cs="Times New Roman"/>
         </w:rPr>
         <w:pict w14:anchorId="6AC4BFD7">
-          <v:rect id="_x0000_i1371" style="width:0;height:1.5pt" o:hralign="center" o:hrstd="t" o:hr="t" fillcolor="#a0a0a0" stroked="f"/>
+          <v:rect id="_x0000_i1053" style="width:0;height:1.5pt" o:hralign="center" o:hrstd="t" o:hr="t" fillcolor="#a0a0a0" stroked="f"/>
         </w:pict>
       </w:r>
     </w:p>
@@ -9822,7 +9822,7 @@
           <w:rFonts w:ascii="Times New Roman" w:hAnsi="Times New Roman" w:cs="Times New Roman"/>
         </w:rPr>
         <w:pict w14:anchorId="19009577">
-          <v:rect id="_x0000_i1372" style="width:0;height:1.5pt" o:hralign="center" o:hrstd="t" o:hr="t" fillcolor="#a0a0a0" stroked="f"/>
+          <v:rect id="_x0000_i1054" style="width:0;height:1.5pt" o:hralign="center" o:hrstd="t" o:hr="t" fillcolor="#a0a0a0" stroked="f"/>
         </w:pict>
       </w:r>
     </w:p>
@@ -10041,7 +10041,7 @@
           <w:rFonts w:ascii="Times New Roman" w:hAnsi="Times New Roman" w:cs="Times New Roman"/>
         </w:rPr>
         <w:pict w14:anchorId="4672C189">
-          <v:rect id="_x0000_i1373" style="width:0;height:1.5pt" o:hralign="center" o:hrstd="t" o:hr="t" fillcolor="#a0a0a0" stroked="f"/>
+          <v:rect id="_x0000_i1055" style="width:0;height:1.5pt" o:hralign="center" o:hrstd="t" o:hr="t" fillcolor="#a0a0a0" stroked="f"/>
         </w:pict>
       </w:r>
     </w:p>
@@ -10519,7 +10519,7 @@
           <w:rFonts w:ascii="Times New Roman" w:hAnsi="Times New Roman" w:cs="Times New Roman"/>
         </w:rPr>
         <w:pict w14:anchorId="3B776D4D">
-          <v:rect id="_x0000_i1374" style="width:0;height:1.5pt" o:hralign="center" o:hrstd="t" o:hr="t" fillcolor="#a0a0a0" stroked="f"/>
+          <v:rect id="_x0000_i1056" style="width:0;height:1.5pt" o:hralign="center" o:hrstd="t" o:hr="t" fillcolor="#a0a0a0" stroked="f"/>
         </w:pict>
       </w:r>
     </w:p>
@@ -10653,7 +10653,7 @@
           <w:rFonts w:ascii="Times New Roman" w:hAnsi="Times New Roman" w:cs="Times New Roman"/>
         </w:rPr>
         <w:pict w14:anchorId="6FA8F637">
-          <v:rect id="_x0000_i1375" style="width:0;height:1.5pt" o:hralign="center" o:hrstd="t" o:hr="t" fillcolor="#a0a0a0" stroked="f"/>
+          <v:rect id="_x0000_i1057" style="width:0;height:1.5pt" o:hralign="center" o:hrstd="t" o:hr="t" fillcolor="#a0a0a0" stroked="f"/>
         </w:pict>
       </w:r>
     </w:p>
@@ -10979,7 +10979,7 @@
           <w:rFonts w:ascii="Times New Roman" w:hAnsi="Times New Roman" w:cs="Times New Roman"/>
         </w:rPr>
         <w:pict w14:anchorId="3FFA949E">
-          <v:rect id="_x0000_i1376" style="width:0;height:1.5pt" o:hralign="center" o:hrstd="t" o:hr="t" fillcolor="#a0a0a0" stroked="f"/>
+          <v:rect id="_x0000_i1058" style="width:0;height:1.5pt" o:hralign="center" o:hrstd="t" o:hr="t" fillcolor="#a0a0a0" stroked="f"/>
         </w:pict>
       </w:r>
     </w:p>
@@ -11181,7 +11181,7 @@
           <w:rFonts w:ascii="Times New Roman" w:hAnsi="Times New Roman" w:cs="Times New Roman"/>
         </w:rPr>
         <w:pict w14:anchorId="0B2435F6">
-          <v:rect id="_x0000_i1377" style="width:0;height:1.5pt" o:hralign="center" o:hrstd="t" o:hr="t" fillcolor="#a0a0a0" stroked="f"/>
+          <v:rect id="_x0000_i1059" style="width:0;height:1.5pt" o:hralign="center" o:hrstd="t" o:hr="t" fillcolor="#a0a0a0" stroked="f"/>
         </w:pict>
       </w:r>
     </w:p>
@@ -11349,7 +11349,7 @@
           <w:rFonts w:ascii="Times New Roman" w:hAnsi="Times New Roman" w:cs="Times New Roman"/>
         </w:rPr>
         <w:pict w14:anchorId="0736D990">
-          <v:rect id="_x0000_i1378" style="width:0;height:1.5pt" o:hralign="center" o:hrstd="t" o:hr="t" fillcolor="#a0a0a0" stroked="f"/>
+          <v:rect id="_x0000_i1060" style="width:0;height:1.5pt" o:hralign="center" o:hrstd="t" o:hr="t" fillcolor="#a0a0a0" stroked="f"/>
         </w:pict>
       </w:r>
     </w:p>
@@ -11467,7 +11467,7 @@
           <w:rFonts w:ascii="Times New Roman" w:hAnsi="Times New Roman" w:cs="Times New Roman"/>
         </w:rPr>
         <w:pict w14:anchorId="5E452FD2">
-          <v:rect id="_x0000_i1379" style="width:0;height:1.5pt" o:hralign="center" o:hrstd="t" o:hr="t" fillcolor="#a0a0a0" stroked="f"/>
+          <v:rect id="_x0000_i1061" style="width:0;height:1.5pt" o:hralign="center" o:hrstd="t" o:hr="t" fillcolor="#a0a0a0" stroked="f"/>
         </w:pict>
       </w:r>
     </w:p>
@@ -11635,7 +11635,7 @@
           <w:rFonts w:ascii="Times New Roman" w:hAnsi="Times New Roman" w:cs="Times New Roman"/>
         </w:rPr>
         <w:pict w14:anchorId="1F486235">
-          <v:rect id="_x0000_i1380" style="width:0;height:1.5pt" o:hralign="center" o:hrstd="t" o:hr="t" fillcolor="#a0a0a0" stroked="f"/>
+          <v:rect id="_x0000_i1062" style="width:0;height:1.5pt" o:hralign="center" o:hrstd="t" o:hr="t" fillcolor="#a0a0a0" stroked="f"/>
         </w:pict>
       </w:r>
     </w:p>
@@ -11800,7 +11800,7 @@
           <w:rFonts w:ascii="Times New Roman" w:hAnsi="Times New Roman" w:cs="Times New Roman"/>
         </w:rPr>
         <w:pict w14:anchorId="36EC59B4">
-          <v:rect id="_x0000_i1381" style="width:0;height:1.5pt" o:hralign="center" o:hrstd="t" o:hr="t" fillcolor="#a0a0a0" stroked="f"/>
+          <v:rect id="_x0000_i1063" style="width:0;height:1.5pt" o:hralign="center" o:hrstd="t" o:hr="t" fillcolor="#a0a0a0" stroked="f"/>
         </w:pict>
       </w:r>
     </w:p>
@@ -12421,7 +12421,7 @@
           <w:rFonts w:ascii="Times New Roman" w:hAnsi="Times New Roman" w:cs="Times New Roman"/>
         </w:rPr>
         <w:pict w14:anchorId="243A2F0D">
-          <v:rect id="_x0000_i1382" style="width:0;height:1.5pt" o:hralign="center" o:hrstd="t" o:hr="t" fillcolor="#a0a0a0" stroked="f"/>
+          <v:rect id="_x0000_i1064" style="width:0;height:1.5pt" o:hralign="center" o:hrstd="t" o:hr="t" fillcolor="#a0a0a0" stroked="f"/>
         </w:pict>
       </w:r>
     </w:p>
@@ -13292,7 +13292,7 @@
           <w:rFonts w:ascii="Times New Roman" w:hAnsi="Times New Roman" w:cs="Times New Roman"/>
         </w:rPr>
         <w:pict w14:anchorId="672BC556">
-          <v:rect id="_x0000_i1383" style="width:0;height:1.5pt" o:hralign="center" o:hrstd="t" o:hr="t" fillcolor="#a0a0a0" stroked="f"/>
+          <v:rect id="_x0000_i1065" style="width:0;height:1.5pt" o:hralign="center" o:hrstd="t" o:hr="t" fillcolor="#a0a0a0" stroked="f"/>
         </w:pict>
       </w:r>
     </w:p>
@@ -13426,7 +13426,7 @@
           <w:rFonts w:ascii="Times New Roman" w:hAnsi="Times New Roman" w:cs="Times New Roman"/>
         </w:rPr>
         <w:pict w14:anchorId="153E5640">
-          <v:rect id="_x0000_i1384" style="width:0;height:1.5pt" o:hralign="center" o:hrstd="t" o:hr="t" fillcolor="#a0a0a0" stroked="f"/>
+          <v:rect id="_x0000_i1066" style="width:0;height:1.5pt" o:hralign="center" o:hrstd="t" o:hr="t" fillcolor="#a0a0a0" stroked="f"/>
         </w:pict>
       </w:r>
     </w:p>
@@ -13593,7 +13593,7 @@
           <w:rFonts w:ascii="Times New Roman" w:hAnsi="Times New Roman" w:cs="Times New Roman"/>
         </w:rPr>
         <w:pict w14:anchorId="137F9F35">
-          <v:rect id="_x0000_i1385" style="width:0;height:1.5pt" o:hralign="center" o:hrstd="t" o:hr="t" fillcolor="#a0a0a0" stroked="f"/>
+          <v:rect id="_x0000_i1067" style="width:0;height:1.5pt" o:hralign="center" o:hrstd="t" o:hr="t" fillcolor="#a0a0a0" stroked="f"/>
         </w:pict>
       </w:r>
     </w:p>
@@ -13716,7 +13716,7 @@
           <w:rFonts w:ascii="Times New Roman" w:hAnsi="Times New Roman" w:cs="Times New Roman"/>
         </w:rPr>
         <w:pict w14:anchorId="220B7272">
-          <v:rect id="_x0000_i1386" style="width:0;height:1.5pt" o:hralign="center" o:hrstd="t" o:hr="t" fillcolor="#a0a0a0" stroked="f"/>
+          <v:rect id="_x0000_i1068" style="width:0;height:1.5pt" o:hralign="center" o:hrstd="t" o:hr="t" fillcolor="#a0a0a0" stroked="f"/>
         </w:pict>
       </w:r>
     </w:p>
@@ -13801,7 +13801,7 @@
           <w:rFonts w:ascii="Times New Roman" w:hAnsi="Times New Roman" w:cs="Times New Roman"/>
         </w:rPr>
         <w:pict w14:anchorId="2C32501D">
-          <v:rect id="_x0000_i1387" style="width:0;height:1.5pt" o:hralign="center" o:hrstd="t" o:hr="t" fillcolor="#a0a0a0" stroked="f"/>
+          <v:rect id="_x0000_i1069" style="width:0;height:1.5pt" o:hralign="center" o:hrstd="t" o:hr="t" fillcolor="#a0a0a0" stroked="f"/>
         </w:pict>
       </w:r>
     </w:p>
@@ -13846,7 +13846,7 @@
           <w:rFonts w:ascii="Times New Roman" w:hAnsi="Times New Roman" w:cs="Times New Roman"/>
         </w:rPr>
         <w:pict w14:anchorId="21383411">
-          <v:rect id="_x0000_i1388" style="width:0;height:1.5pt" o:hralign="center" o:hrstd="t" o:hr="t" fillcolor="#a0a0a0" stroked="f"/>
+          <v:rect id="_x0000_i1070" style="width:0;height:1.5pt" o:hralign="center" o:hrstd="t" o:hr="t" fillcolor="#a0a0a0" stroked="f"/>
         </w:pict>
       </w:r>
     </w:p>
@@ -13904,7 +13904,7 @@
           <w:rFonts w:ascii="Times New Roman" w:hAnsi="Times New Roman" w:cs="Times New Roman"/>
         </w:rPr>
         <w:pict w14:anchorId="04322741">
-          <v:rect id="_x0000_i1389" style="width:0;height:1.5pt" o:hralign="center" o:hrstd="t" o:hr="t" fillcolor="#a0a0a0" stroked="f"/>
+          <v:rect id="_x0000_i1071" style="width:0;height:1.5pt" o:hralign="center" o:hrstd="t" o:hr="t" fillcolor="#a0a0a0" stroked="f"/>
         </w:pict>
       </w:r>
     </w:p>
@@ -13949,7 +13949,7 @@
           <w:rFonts w:ascii="Times New Roman" w:hAnsi="Times New Roman" w:cs="Times New Roman"/>
         </w:rPr>
         <w:pict w14:anchorId="13188923">
-          <v:rect id="_x0000_i1390" style="width:0;height:1.5pt" o:hralign="center" o:hrstd="t" o:hr="t" fillcolor="#a0a0a0" stroked="f"/>
+          <v:rect id="_x0000_i1072" style="width:0;height:1.5pt" o:hralign="center" o:hrstd="t" o:hr="t" fillcolor="#a0a0a0" stroked="f"/>
         </w:pict>
       </w:r>
     </w:p>
@@ -14007,7 +14007,7 @@
           <w:rFonts w:ascii="Times New Roman" w:hAnsi="Times New Roman" w:cs="Times New Roman"/>
         </w:rPr>
         <w:pict w14:anchorId="2F51B0C0">
-          <v:rect id="_x0000_i1391" style="width:0;height:1.5pt" o:hralign="center" o:hrstd="t" o:hr="t" fillcolor="#a0a0a0" stroked="f"/>
+          <v:rect id="_x0000_i1073" style="width:0;height:1.5pt" o:hralign="center" o:hrstd="t" o:hr="t" fillcolor="#a0a0a0" stroked="f"/>
         </w:pict>
       </w:r>
     </w:p>
@@ -14742,7 +14742,7 @@
           <w:rFonts w:ascii="Times New Roman" w:hAnsi="Times New Roman" w:cs="Times New Roman"/>
         </w:rPr>
         <w:pict w14:anchorId="6BF66F98">
-          <v:rect id="_x0000_i1392" style="width:0;height:1.5pt" o:hralign="center" o:hrstd="t" o:hr="t" fillcolor="#a0a0a0" stroked="f"/>
+          <v:rect id="_x0000_i1074" style="width:0;height:1.5pt" o:hralign="center" o:hrstd="t" o:hr="t" fillcolor="#a0a0a0" stroked="f"/>
         </w:pict>
       </w:r>
     </w:p>
@@ -14984,7 +14984,7 @@
           <w:rFonts w:ascii="Times New Roman" w:hAnsi="Times New Roman" w:cs="Times New Roman"/>
         </w:rPr>
         <w:pict w14:anchorId="6823FCBF">
-          <v:rect id="_x0000_i1393" style="width:0;height:1.5pt" o:hralign="center" o:hrstd="t" o:hr="t" fillcolor="#a0a0a0" stroked="f"/>
+          <v:rect id="_x0000_i1075" style="width:0;height:1.5pt" o:hralign="center" o:hrstd="t" o:hr="t" fillcolor="#a0a0a0" stroked="f"/>
         </w:pict>
       </w:r>
     </w:p>
@@ -15462,7 +15462,7 @@
           <w:rFonts w:ascii="Times New Roman" w:hAnsi="Times New Roman" w:cs="Times New Roman"/>
         </w:rPr>
         <w:pict w14:anchorId="47A42632">
-          <v:rect id="_x0000_i1394" style="width:0;height:1.5pt" o:hralign="center" o:hrstd="t" o:hr="t" fillcolor="#a0a0a0" stroked="f"/>
+          <v:rect id="_x0000_i1076" style="width:0;height:1.5pt" o:hralign="center" o:hrstd="t" o:hr="t" fillcolor="#a0a0a0" stroked="f"/>
         </w:pict>
       </w:r>
     </w:p>
@@ -15594,7 +15594,7 @@
           <w:rFonts w:ascii="Times New Roman" w:hAnsi="Times New Roman" w:cs="Times New Roman"/>
         </w:rPr>
         <w:pict w14:anchorId="7F5A1AD6">
-          <v:rect id="_x0000_i1395" style="width:0;height:1.5pt" o:hralign="center" o:hrstd="t" o:hr="t" fillcolor="#a0a0a0" stroked="f"/>
+          <v:rect id="_x0000_i1077" style="width:0;height:1.5pt" o:hralign="center" o:hrstd="t" o:hr="t" fillcolor="#a0a0a0" stroked="f"/>
         </w:pict>
       </w:r>
     </w:p>
@@ -15838,6 +15838,1102 @@
         </w:rPr>
         <w:t>. If something isn't in this document, we don't spend precious implementation time on it unless we explicitly decide to change the scope.</w:t>
       </w:r>
+    </w:p>
+    <w:p>
+      <w:pPr>
+        <w:rPr>
+          <w:rFonts w:ascii="Times New Roman" w:hAnsi="Times New Roman" w:cs="Times New Roman"/>
+        </w:rPr>
+      </w:pPr>
+    </w:p>
+    <w:p>
+      <w:pPr>
+        <w:rPr>
+          <w:rFonts w:ascii="Times New Roman" w:hAnsi="Times New Roman" w:cs="Times New Roman"/>
+          <w:b/>
+          <w:bCs/>
+        </w:rPr>
+      </w:pPr>
+      <w:r>
+        <w:rPr>
+          <w:rFonts w:ascii="Segoe UI Emoji" w:hAnsi="Segoe UI Emoji" w:cs="Segoe UI Emoji"/>
+          <w:b/>
+          <w:bCs/>
+        </w:rPr>
+        <w:t>🔴</w:t>
+      </w:r>
+      <w:r>
+        <w:rPr>
+          <w:rFonts w:ascii="Times New Roman" w:hAnsi="Times New Roman" w:cs="Times New Roman"/>
+          <w:b/>
+          <w:bCs/>
+        </w:rPr>
+        <w:t xml:space="preserve"> Final Emergency Pipeline</w:t>
+      </w:r>
+    </w:p>
+    <w:p>
+      <w:pPr>
+        <w:rPr>
+          <w:rFonts w:ascii="Times New Roman" w:hAnsi="Times New Roman" w:cs="Times New Roman"/>
+        </w:rPr>
+      </w:pPr>
+      <w:r>
+        <w:rPr>
+          <w:rFonts w:ascii="Times New Roman" w:hAnsi="Times New Roman" w:cs="Times New Roman"/>
+          <w:b/>
+          <w:bCs/>
+        </w:rPr>
+        <w:t>Validated emergency detected</w:t>
+      </w:r>
+      <w:r>
+        <w:rPr>
+          <w:rFonts w:ascii="Times New Roman" w:hAnsi="Times New Roman" w:cs="Times New Roman"/>
+        </w:rPr>
+        <w:br/>
+        <w:t>↓</w:t>
+      </w:r>
+      <w:r>
+        <w:rPr>
+          <w:rFonts w:ascii="Times New Roman" w:hAnsi="Times New Roman" w:cs="Times New Roman"/>
+        </w:rPr>
+        <w:br/>
+      </w:r>
+      <w:r>
+        <w:rPr>
+          <w:rFonts w:ascii="Times New Roman" w:hAnsi="Times New Roman" w:cs="Times New Roman"/>
+          <w:b/>
+          <w:bCs/>
+        </w:rPr>
+        <w:t>Emergency card appears</w:t>
+      </w:r>
+      <w:r>
+        <w:rPr>
+          <w:rFonts w:ascii="Times New Roman" w:hAnsi="Times New Roman" w:cs="Times New Roman"/>
+        </w:rPr>
+        <w:br/>
+        <w:t>↓</w:t>
+      </w:r>
+      <w:r>
+        <w:rPr>
+          <w:rFonts w:ascii="Times New Roman" w:hAnsi="Times New Roman" w:cs="Times New Roman"/>
+        </w:rPr>
+        <w:br/>
+      </w:r>
+      <w:r>
+        <w:rPr>
+          <w:rFonts w:ascii="Times New Roman" w:hAnsi="Times New Roman" w:cs="Times New Roman"/>
+          <w:b/>
+          <w:bCs/>
+        </w:rPr>
+        <w:t>Voice prompt + response window</w:t>
+      </w:r>
+    </w:p>
+    <w:p>
+      <w:pPr>
+        <w:numPr>
+          <w:ilvl w:val="0"/>
+          <w:numId w:val="67"/>
+        </w:numPr>
+        <w:rPr>
+          <w:rFonts w:ascii="Times New Roman" w:hAnsi="Times New Roman" w:cs="Times New Roman"/>
+        </w:rPr>
+      </w:pPr>
+      <w:r>
+        <w:rPr>
+          <w:rFonts w:ascii="Times New Roman" w:hAnsi="Times New Roman" w:cs="Times New Roman"/>
+        </w:rPr>
+        <w:t xml:space="preserve">TTS speaks the prompt </w:t>
+      </w:r>
+    </w:p>
+    <w:p>
+      <w:pPr>
+        <w:numPr>
+          <w:ilvl w:val="0"/>
+          <w:numId w:val="67"/>
+        </w:numPr>
+        <w:rPr>
+          <w:rFonts w:ascii="Times New Roman" w:hAnsi="Times New Roman" w:cs="Times New Roman"/>
+        </w:rPr>
+      </w:pPr>
+      <w:r>
+        <w:rPr>
+          <w:rFonts w:ascii="Times New Roman" w:hAnsi="Times New Roman" w:cs="Times New Roman"/>
+        </w:rPr>
+        <w:t xml:space="preserve">Microphone stays OFF during TTS </w:t>
+      </w:r>
+    </w:p>
+    <w:p>
+      <w:pPr>
+        <w:numPr>
+          <w:ilvl w:val="0"/>
+          <w:numId w:val="67"/>
+        </w:numPr>
+        <w:rPr>
+          <w:rFonts w:ascii="Times New Roman" w:hAnsi="Times New Roman" w:cs="Times New Roman"/>
+        </w:rPr>
+      </w:pPr>
+      <w:r>
+        <w:rPr>
+          <w:rFonts w:ascii="Times New Roman" w:hAnsi="Times New Roman" w:cs="Times New Roman"/>
+        </w:rPr>
+        <w:t xml:space="preserve">Microphone activates only after the prompt finishes </w:t>
+      </w:r>
+    </w:p>
+    <w:p>
+      <w:pPr>
+        <w:numPr>
+          <w:ilvl w:val="0"/>
+          <w:numId w:val="67"/>
+        </w:numPr>
+        <w:rPr>
+          <w:rFonts w:ascii="Times New Roman" w:hAnsi="Times New Roman" w:cs="Times New Roman"/>
+        </w:rPr>
+      </w:pPr>
+      <w:r>
+        <w:rPr>
+          <w:rFonts w:ascii="Times New Roman" w:hAnsi="Times New Roman" w:cs="Times New Roman"/>
+        </w:rPr>
+        <w:t xml:space="preserve">Buttons remain available </w:t>
+      </w:r>
+    </w:p>
+    <w:p>
+      <w:pPr>
+        <w:rPr>
+          <w:rFonts w:ascii="Times New Roman" w:hAnsi="Times New Roman" w:cs="Times New Roman"/>
+        </w:rPr>
+      </w:pPr>
+      <w:r>
+        <w:rPr>
+          <w:rFonts w:ascii="Times New Roman" w:hAnsi="Times New Roman" w:cs="Times New Roman"/>
+        </w:rPr>
+        <w:t>↓</w:t>
+      </w:r>
+    </w:p>
+    <w:p>
+      <w:pPr>
+        <w:rPr>
+          <w:rFonts w:ascii="Times New Roman" w:hAnsi="Times New Roman" w:cs="Times New Roman"/>
+        </w:rPr>
+      </w:pPr>
+      <w:r>
+        <w:rPr>
+          <w:rFonts w:ascii="Times New Roman" w:hAnsi="Times New Roman" w:cs="Times New Roman"/>
+          <w:b/>
+          <w:bCs/>
+        </w:rPr>
+        <w:t>User response</w:t>
+      </w:r>
+    </w:p>
+    <w:p>
+      <w:pPr>
+        <w:numPr>
+          <w:ilvl w:val="0"/>
+          <w:numId w:val="68"/>
+        </w:numPr>
+        <w:rPr>
+          <w:rFonts w:ascii="Times New Roman" w:hAnsi="Times New Roman" w:cs="Times New Roman"/>
+        </w:rPr>
+      </w:pPr>
+      <w:r>
+        <w:rPr>
+          <w:rFonts w:ascii="Times New Roman" w:hAnsi="Times New Roman" w:cs="Times New Roman"/>
+          <w:b/>
+          <w:bCs/>
+        </w:rPr>
+        <w:t>“I’m OK” / I'm OK button</w:t>
+      </w:r>
+      <w:r>
+        <w:rPr>
+          <w:rFonts w:ascii="Times New Roman" w:hAnsi="Times New Roman" w:cs="Times New Roman"/>
+        </w:rPr>
+        <w:t xml:space="preserve"> → Emergency </w:t>
+      </w:r>
+      <w:r>
+        <w:rPr>
+          <w:rFonts w:ascii="Times New Roman" w:hAnsi="Times New Roman" w:cs="Times New Roman"/>
+          <w:b/>
+          <w:bCs/>
+        </w:rPr>
+        <w:t>cancelled/resolved</w:t>
+      </w:r>
+      <w:r>
+        <w:rPr>
+          <w:rFonts w:ascii="Times New Roman" w:hAnsi="Times New Roman" w:cs="Times New Roman"/>
+        </w:rPr>
+        <w:t xml:space="preserve"> </w:t>
+      </w:r>
+    </w:p>
+    <w:p>
+      <w:pPr>
+        <w:numPr>
+          <w:ilvl w:val="0"/>
+          <w:numId w:val="68"/>
+        </w:numPr>
+        <w:rPr>
+          <w:rFonts w:ascii="Times New Roman" w:hAnsi="Times New Roman" w:cs="Times New Roman"/>
+        </w:rPr>
+      </w:pPr>
+      <w:r>
+        <w:rPr>
+          <w:rFonts w:ascii="Times New Roman" w:hAnsi="Times New Roman" w:cs="Times New Roman"/>
+          <w:b/>
+          <w:bCs/>
+        </w:rPr>
+        <w:t>“Emergency” / “Help” / Emergency button</w:t>
+      </w:r>
+      <w:r>
+        <w:rPr>
+          <w:rFonts w:ascii="Times New Roman" w:hAnsi="Times New Roman" w:cs="Times New Roman"/>
+        </w:rPr>
+        <w:t xml:space="preserve"> → </w:t>
+      </w:r>
+      <w:r>
+        <w:rPr>
+          <w:rFonts w:ascii="Times New Roman" w:hAnsi="Times New Roman" w:cs="Times New Roman"/>
+          <w:b/>
+          <w:bCs/>
+        </w:rPr>
+        <w:t>Emergency declared</w:t>
+      </w:r>
+      <w:r>
+        <w:rPr>
+          <w:rFonts w:ascii="Times New Roman" w:hAnsi="Times New Roman" w:cs="Times New Roman"/>
+        </w:rPr>
+        <w:t xml:space="preserve"> </w:t>
+      </w:r>
+    </w:p>
+    <w:p>
+      <w:pPr>
+        <w:numPr>
+          <w:ilvl w:val="0"/>
+          <w:numId w:val="68"/>
+        </w:numPr>
+        <w:rPr>
+          <w:rFonts w:ascii="Times New Roman" w:hAnsi="Times New Roman" w:cs="Times New Roman"/>
+        </w:rPr>
+      </w:pPr>
+      <w:r>
+        <w:rPr>
+          <w:rFonts w:ascii="Times New Roman" w:hAnsi="Times New Roman" w:cs="Times New Roman"/>
+          <w:b/>
+          <w:bCs/>
+        </w:rPr>
+        <w:t>No response</w:t>
+      </w:r>
+      <w:r>
+        <w:rPr>
+          <w:rFonts w:ascii="Times New Roman" w:hAnsi="Times New Roman" w:cs="Times New Roman"/>
+        </w:rPr>
+        <w:t xml:space="preserve"> → </w:t>
+      </w:r>
+      <w:r>
+        <w:rPr>
+          <w:rFonts w:ascii="Times New Roman" w:hAnsi="Times New Roman" w:cs="Times New Roman"/>
+          <w:b/>
+          <w:bCs/>
+        </w:rPr>
+        <w:t>Emergency declared</w:t>
+      </w:r>
+      <w:r>
+        <w:rPr>
+          <w:rFonts w:ascii="Times New Roman" w:hAnsi="Times New Roman" w:cs="Times New Roman"/>
+        </w:rPr>
+        <w:t xml:space="preserve"> </w:t>
+      </w:r>
+    </w:p>
+    <w:p>
+      <w:pPr>
+        <w:rPr>
+          <w:rFonts w:ascii="Times New Roman" w:hAnsi="Times New Roman" w:cs="Times New Roman"/>
+        </w:rPr>
+      </w:pPr>
+      <w:r>
+        <w:rPr>
+          <w:rFonts w:ascii="Times New Roman" w:hAnsi="Times New Roman" w:cs="Times New Roman"/>
+        </w:rPr>
+        <w:t>↓</w:t>
+      </w:r>
+    </w:p>
+    <w:p>
+      <w:pPr>
+        <w:rPr>
+          <w:rFonts w:ascii="Times New Roman" w:hAnsi="Times New Roman" w:cs="Times New Roman"/>
+          <w:b/>
+          <w:bCs/>
+        </w:rPr>
+      </w:pPr>
+      <w:r>
+        <w:rPr>
+          <w:rFonts w:ascii="Segoe UI Emoji" w:hAnsi="Segoe UI Emoji" w:cs="Segoe UI Emoji"/>
+          <w:b/>
+          <w:bCs/>
+        </w:rPr>
+        <w:t>🚨</w:t>
+      </w:r>
+      <w:r>
+        <w:rPr>
+          <w:rFonts w:ascii="Times New Roman" w:hAnsi="Times New Roman" w:cs="Times New Roman"/>
+          <w:b/>
+          <w:bCs/>
+        </w:rPr>
+        <w:t xml:space="preserve"> Emergency declared</w:t>
+      </w:r>
+    </w:p>
+    <w:p>
+      <w:pPr>
+        <w:rPr>
+          <w:rFonts w:ascii="Times New Roman" w:hAnsi="Times New Roman" w:cs="Times New Roman"/>
+        </w:rPr>
+      </w:pPr>
+      <w:r>
+        <w:rPr>
+          <w:rFonts w:ascii="Times New Roman" w:hAnsi="Times New Roman" w:cs="Times New Roman"/>
+          <w:b/>
+          <w:bCs/>
+        </w:rPr>
+        <w:t>1. Create/store Emergency Event</w:t>
+      </w:r>
+    </w:p>
+    <w:p>
+      <w:pPr>
+        <w:rPr>
+          <w:rFonts w:ascii="Times New Roman" w:hAnsi="Times New Roman" w:cs="Times New Roman"/>
+        </w:rPr>
+      </w:pPr>
+      <w:r>
+        <w:rPr>
+          <w:rFonts w:ascii="Times New Roman" w:hAnsi="Times New Roman" w:cs="Times New Roman"/>
+        </w:rPr>
+        <w:t>Store:</w:t>
+      </w:r>
+    </w:p>
+    <w:p>
+      <w:pPr>
+        <w:numPr>
+          <w:ilvl w:val="0"/>
+          <w:numId w:val="69"/>
+        </w:numPr>
+        <w:rPr>
+          <w:rFonts w:ascii="Times New Roman" w:hAnsi="Times New Roman" w:cs="Times New Roman"/>
+        </w:rPr>
+      </w:pPr>
+      <w:r>
+        <w:rPr>
+          <w:rFonts w:ascii="Times New Roman" w:hAnsi="Times New Roman" w:cs="Times New Roman"/>
+        </w:rPr>
+        <w:t xml:space="preserve">Patient </w:t>
+      </w:r>
+    </w:p>
+    <w:p>
+      <w:pPr>
+        <w:numPr>
+          <w:ilvl w:val="0"/>
+          <w:numId w:val="69"/>
+        </w:numPr>
+        <w:rPr>
+          <w:rFonts w:ascii="Times New Roman" w:hAnsi="Times New Roman" w:cs="Times New Roman"/>
+        </w:rPr>
+      </w:pPr>
+      <w:r>
+        <w:rPr>
+          <w:rFonts w:ascii="Times New Roman" w:hAnsi="Times New Roman" w:cs="Times New Roman"/>
+        </w:rPr>
+        <w:t xml:space="preserve">Band </w:t>
+      </w:r>
+    </w:p>
+    <w:p>
+      <w:pPr>
+        <w:numPr>
+          <w:ilvl w:val="0"/>
+          <w:numId w:val="69"/>
+        </w:numPr>
+        <w:rPr>
+          <w:rFonts w:ascii="Times New Roman" w:hAnsi="Times New Roman" w:cs="Times New Roman"/>
+        </w:rPr>
+      </w:pPr>
+      <w:r>
+        <w:rPr>
+          <w:rFonts w:ascii="Times New Roman" w:hAnsi="Times New Roman" w:cs="Times New Roman"/>
+        </w:rPr>
+        <w:t xml:space="preserve">Monitoring Session </w:t>
+      </w:r>
+    </w:p>
+    <w:p>
+      <w:pPr>
+        <w:numPr>
+          <w:ilvl w:val="0"/>
+          <w:numId w:val="69"/>
+        </w:numPr>
+        <w:rPr>
+          <w:rFonts w:ascii="Times New Roman" w:hAnsi="Times New Roman" w:cs="Times New Roman"/>
+        </w:rPr>
+      </w:pPr>
+      <w:r>
+        <w:rPr>
+          <w:rFonts w:ascii="Times New Roman" w:hAnsi="Times New Roman" w:cs="Times New Roman"/>
+        </w:rPr>
+        <w:t xml:space="preserve">Event type </w:t>
+      </w:r>
+    </w:p>
+    <w:p>
+      <w:pPr>
+        <w:numPr>
+          <w:ilvl w:val="0"/>
+          <w:numId w:val="69"/>
+        </w:numPr>
+        <w:rPr>
+          <w:rFonts w:ascii="Times New Roman" w:hAnsi="Times New Roman" w:cs="Times New Roman"/>
+        </w:rPr>
+      </w:pPr>
+      <w:r>
+        <w:rPr>
+          <w:rFonts w:ascii="Times New Roman" w:hAnsi="Times New Roman" w:cs="Times New Roman"/>
+        </w:rPr>
+        <w:t xml:space="preserve">Vitals </w:t>
+      </w:r>
+    </w:p>
+    <w:p>
+      <w:pPr>
+        <w:numPr>
+          <w:ilvl w:val="0"/>
+          <w:numId w:val="69"/>
+        </w:numPr>
+        <w:rPr>
+          <w:rFonts w:ascii="Times New Roman" w:hAnsi="Times New Roman" w:cs="Times New Roman"/>
+        </w:rPr>
+      </w:pPr>
+      <w:r>
+        <w:rPr>
+          <w:rFonts w:ascii="Times New Roman" w:hAnsi="Times New Roman" w:cs="Times New Roman"/>
+        </w:rPr>
+        <w:t xml:space="preserve">Movement information </w:t>
+      </w:r>
+    </w:p>
+    <w:p>
+      <w:pPr>
+        <w:numPr>
+          <w:ilvl w:val="0"/>
+          <w:numId w:val="69"/>
+        </w:numPr>
+        <w:rPr>
+          <w:rFonts w:ascii="Times New Roman" w:hAnsi="Times New Roman" w:cs="Times New Roman"/>
+        </w:rPr>
+      </w:pPr>
+      <w:r>
+        <w:rPr>
+          <w:rFonts w:ascii="Times New Roman" w:hAnsi="Times New Roman" w:cs="Times New Roman"/>
+        </w:rPr>
+        <w:t xml:space="preserve">Time </w:t>
+      </w:r>
+    </w:p>
+    <w:p>
+      <w:pPr>
+        <w:numPr>
+          <w:ilvl w:val="0"/>
+          <w:numId w:val="69"/>
+        </w:numPr>
+        <w:rPr>
+          <w:rFonts w:ascii="Times New Roman" w:hAnsi="Times New Roman" w:cs="Times New Roman"/>
+        </w:rPr>
+      </w:pPr>
+      <w:r>
+        <w:rPr>
+          <w:rFonts w:ascii="Times New Roman" w:hAnsi="Times New Roman" w:cs="Times New Roman"/>
+        </w:rPr>
+        <w:t xml:space="preserve">Location, when available </w:t>
+      </w:r>
+    </w:p>
+    <w:p>
+      <w:pPr>
+        <w:rPr>
+          <w:rFonts w:ascii="Times New Roman" w:hAnsi="Times New Roman" w:cs="Times New Roman"/>
+        </w:rPr>
+      </w:pPr>
+      <w:r>
+        <w:rPr>
+          <w:rFonts w:ascii="Times New Roman" w:hAnsi="Times New Roman" w:cs="Times New Roman"/>
+          <w:b/>
+          <w:bCs/>
+        </w:rPr>
+        <w:t>2. Send ONE SMS to the registered emergency contact</w:t>
+      </w:r>
+    </w:p>
+    <w:p>
+      <w:pPr>
+        <w:rPr>
+          <w:rFonts w:ascii="Times New Roman" w:hAnsi="Times New Roman" w:cs="Times New Roman"/>
+        </w:rPr>
+      </w:pPr>
+      <w:r>
+        <w:rPr>
+          <w:rFonts w:ascii="Times New Roman" w:hAnsi="Times New Roman" w:cs="Times New Roman"/>
+        </w:rPr>
+        <w:t>MEDJARVIS EMERGENCY</w:t>
+      </w:r>
+    </w:p>
+    <w:p>
+      <w:pPr>
+        <w:rPr>
+          <w:rFonts w:ascii="Times New Roman" w:hAnsi="Times New Roman" w:cs="Times New Roman"/>
+        </w:rPr>
+      </w:pPr>
+      <w:r>
+        <w:rPr>
+          <w:rFonts w:ascii="Times New Roman" w:hAnsi="Times New Roman" w:cs="Times New Roman"/>
+        </w:rPr>
+        <w:t>Patient: [Name]</w:t>
+      </w:r>
+    </w:p>
+    <w:p>
+      <w:pPr>
+        <w:rPr>
+          <w:rFonts w:ascii="Times New Roman" w:hAnsi="Times New Roman" w:cs="Times New Roman"/>
+        </w:rPr>
+      </w:pPr>
+      <w:r>
+        <w:rPr>
+          <w:rFonts w:ascii="Times New Roman" w:hAnsi="Times New Roman" w:cs="Times New Roman"/>
+        </w:rPr>
+        <w:t>Possible fall/emergency detected.</w:t>
+      </w:r>
+    </w:p>
+    <w:p>
+      <w:pPr>
+        <w:rPr>
+          <w:rFonts w:ascii="Times New Roman" w:hAnsi="Times New Roman" w:cs="Times New Roman"/>
+        </w:rPr>
+      </w:pPr>
+      <w:r>
+        <w:rPr>
+          <w:rFonts w:ascii="Times New Roman" w:hAnsi="Times New Roman" w:cs="Times New Roman"/>
+        </w:rPr>
+        <w:t>Time: [Time]</w:t>
+      </w:r>
+    </w:p>
+    <w:p>
+      <w:pPr>
+        <w:rPr>
+          <w:rFonts w:ascii="Times New Roman" w:hAnsi="Times New Roman" w:cs="Times New Roman"/>
+        </w:rPr>
+      </w:pPr>
+      <w:r>
+        <w:rPr>
+          <w:rFonts w:ascii="Times New Roman" w:hAnsi="Times New Roman" w:cs="Times New Roman"/>
+        </w:rPr>
+        <w:t>Location: [Location/link if available]</w:t>
+      </w:r>
+    </w:p>
+    <w:p>
+      <w:pPr>
+        <w:rPr>
+          <w:rFonts w:ascii="Times New Roman" w:hAnsi="Times New Roman" w:cs="Times New Roman"/>
+        </w:rPr>
+      </w:pPr>
+      <w:r>
+        <w:rPr>
+          <w:rFonts w:ascii="Times New Roman" w:hAnsi="Times New Roman" w:cs="Times New Roman"/>
+        </w:rPr>
+        <w:t>Please check immediately.</w:t>
+      </w:r>
+    </w:p>
+    <w:p>
+      <w:pPr>
+        <w:rPr>
+          <w:rFonts w:ascii="Times New Roman" w:hAnsi="Times New Roman" w:cs="Times New Roman"/>
+        </w:rPr>
+      </w:pPr>
+      <w:r>
+        <w:rPr>
+          <w:rFonts w:ascii="Times New Roman" w:hAnsi="Times New Roman" w:cs="Times New Roman"/>
+        </w:rPr>
+        <w:t xml:space="preserve">— </w:t>
+      </w:r>
+      <w:proofErr w:type="spellStart"/>
+      <w:r>
+        <w:rPr>
+          <w:rFonts w:ascii="Times New Roman" w:hAnsi="Times New Roman" w:cs="Times New Roman"/>
+        </w:rPr>
+        <w:t>MedJarvis</w:t>
+      </w:r>
+      <w:proofErr w:type="spellEnd"/>
+    </w:p>
+    <w:p>
+      <w:pPr>
+        <w:rPr>
+          <w:rFonts w:ascii="Times New Roman" w:hAnsi="Times New Roman" w:cs="Times New Roman"/>
+        </w:rPr>
+      </w:pPr>
+      <w:r>
+        <w:rPr>
+          <w:rFonts w:ascii="Times New Roman" w:hAnsi="Times New Roman" w:cs="Times New Roman"/>
+          <w:b/>
+          <w:bCs/>
+        </w:rPr>
+        <w:t>3. After SMS succeeds → automatically call the SAME emergency contact</w:t>
+      </w:r>
+    </w:p>
+    <w:p>
+      <w:pPr>
+        <w:rPr>
+          <w:rFonts w:ascii="Times New Roman" w:hAnsi="Times New Roman" w:cs="Times New Roman"/>
+        </w:rPr>
+      </w:pPr>
+      <w:r>
+        <w:rPr>
+          <w:rFonts w:ascii="Times New Roman" w:hAnsi="Times New Roman" w:cs="Times New Roman"/>
+        </w:rPr>
+        <w:t xml:space="preserve">The call happens </w:t>
+      </w:r>
+      <w:r>
+        <w:rPr>
+          <w:rFonts w:ascii="Times New Roman" w:hAnsi="Times New Roman" w:cs="Times New Roman"/>
+          <w:b/>
+          <w:bCs/>
+        </w:rPr>
+        <w:t>only after the emergency has actually been declared</w:t>
+      </w:r>
+      <w:r>
+        <w:rPr>
+          <w:rFonts w:ascii="Times New Roman" w:hAnsi="Times New Roman" w:cs="Times New Roman"/>
+        </w:rPr>
+        <w:t>, never merely when the sensor initially detects a possible emergency.</w:t>
+      </w:r>
+    </w:p>
+    <w:p>
+      <w:pPr>
+        <w:rPr>
+          <w:rFonts w:ascii="Times New Roman" w:hAnsi="Times New Roman" w:cs="Times New Roman"/>
+        </w:rPr>
+      </w:pPr>
+      <w:r>
+        <w:rPr>
+          <w:rFonts w:ascii="Times New Roman" w:hAnsi="Times New Roman" w:cs="Times New Roman"/>
+          <w:b/>
+          <w:bCs/>
+        </w:rPr>
+        <w:t xml:space="preserve">4. Emergency remains ACTIVE in </w:t>
+      </w:r>
+      <w:proofErr w:type="spellStart"/>
+      <w:r>
+        <w:rPr>
+          <w:rFonts w:ascii="Times New Roman" w:hAnsi="Times New Roman" w:cs="Times New Roman"/>
+          <w:b/>
+          <w:bCs/>
+        </w:rPr>
+        <w:t>MedJarvis</w:t>
+      </w:r>
+      <w:proofErr w:type="spellEnd"/>
+    </w:p>
+    <w:p>
+      <w:pPr>
+        <w:rPr>
+          <w:rFonts w:ascii="Times New Roman" w:hAnsi="Times New Roman" w:cs="Times New Roman"/>
+        </w:rPr>
+      </w:pPr>
+      <w:r>
+        <w:rPr>
+          <w:rFonts w:ascii="Times New Roman" w:hAnsi="Times New Roman" w:cs="Times New Roman"/>
+        </w:rPr>
+        <w:t>↓</w:t>
+      </w:r>
+    </w:p>
+    <w:p>
+      <w:pPr>
+        <w:rPr>
+          <w:rFonts w:ascii="Times New Roman" w:hAnsi="Times New Roman" w:cs="Times New Roman"/>
+        </w:rPr>
+      </w:pPr>
+      <w:r>
+        <w:rPr>
+          <w:rFonts w:ascii="Times New Roman" w:hAnsi="Times New Roman" w:cs="Times New Roman"/>
+        </w:rPr>
+        <w:t>The user can later press:</w:t>
+      </w:r>
+    </w:p>
+    <w:p>
+      <w:pPr>
+        <w:rPr>
+          <w:rFonts w:ascii="Times New Roman" w:hAnsi="Times New Roman" w:cs="Times New Roman"/>
+        </w:rPr>
+      </w:pPr>
+      <w:r>
+        <w:rPr>
+          <w:rFonts w:ascii="Segoe UI Emoji" w:hAnsi="Segoe UI Emoji" w:cs="Segoe UI Emoji"/>
+          <w:b/>
+          <w:bCs/>
+        </w:rPr>
+        <w:t>🟢</w:t>
+      </w:r>
+      <w:r>
+        <w:rPr>
+          <w:rFonts w:ascii="Times New Roman" w:hAnsi="Times New Roman" w:cs="Times New Roman"/>
+          <w:b/>
+          <w:bCs/>
+        </w:rPr>
+        <w:t xml:space="preserve"> I'M SAFE — STOP EMERGENCY</w:t>
+      </w:r>
+    </w:p>
+    <w:p>
+      <w:pPr>
+        <w:rPr>
+          <w:rFonts w:ascii="Times New Roman" w:hAnsi="Times New Roman" w:cs="Times New Roman"/>
+        </w:rPr>
+      </w:pPr>
+      <w:r>
+        <w:rPr>
+          <w:rFonts w:ascii="Times New Roman" w:hAnsi="Times New Roman" w:cs="Times New Roman"/>
+        </w:rPr>
+        <w:t>→ Stop ongoing emergency handling</w:t>
+      </w:r>
+      <w:r>
+        <w:rPr>
+          <w:rFonts w:ascii="Times New Roman" w:hAnsi="Times New Roman" w:cs="Times New Roman"/>
+        </w:rPr>
+        <w:br/>
+        <w:t xml:space="preserve">→ Event becomes </w:t>
+      </w:r>
+      <w:r>
+        <w:rPr>
+          <w:rFonts w:ascii="Times New Roman" w:hAnsi="Times New Roman" w:cs="Times New Roman"/>
+          <w:b/>
+          <w:bCs/>
+        </w:rPr>
+        <w:t>RESOLVED</w:t>
+      </w:r>
+      <w:r>
+        <w:rPr>
+          <w:rFonts w:ascii="Times New Roman" w:hAnsi="Times New Roman" w:cs="Times New Roman"/>
+        </w:rPr>
+        <w:br/>
+        <w:t xml:space="preserve">→ </w:t>
+      </w:r>
+      <w:r>
+        <w:rPr>
+          <w:rFonts w:ascii="Times New Roman" w:hAnsi="Times New Roman" w:cs="Times New Roman"/>
+          <w:b/>
+          <w:bCs/>
+        </w:rPr>
+        <w:t>Event is NOT deleted from history</w:t>
+      </w:r>
+      <w:r>
+        <w:rPr>
+          <w:rFonts w:ascii="Times New Roman" w:hAnsi="Times New Roman" w:cs="Times New Roman"/>
+        </w:rPr>
+        <w:br/>
+        <w:t>→ Already-sent SMS/call cannot be undone.</w:t>
+      </w:r>
+    </w:p>
+    <w:p>
+      <w:pPr>
+        <w:rPr>
+          <w:rFonts w:ascii="Times New Roman" w:hAnsi="Times New Roman" w:cs="Times New Roman"/>
+        </w:rPr>
+      </w:pPr>
+      <w:r>
+        <w:rPr>
+          <w:rFonts w:ascii="Times New Roman" w:hAnsi="Times New Roman" w:cs="Times New Roman"/>
+        </w:rPr>
+        <w:pict w14:anchorId="697B8BA0">
+          <v:rect id="_x0000_i1084" style="width:0;height:1.5pt" o:hralign="center" o:hrstd="t" o:hr="t" fillcolor="#a0a0a0" stroked="f"/>
+        </w:pict>
+      </w:r>
+    </w:p>
+    <w:p>
+      <w:pPr>
+        <w:rPr>
+          <w:rFonts w:ascii="Times New Roman" w:hAnsi="Times New Roman" w:cs="Times New Roman"/>
+          <w:b/>
+          <w:bCs/>
+        </w:rPr>
+      </w:pPr>
+      <w:r>
+        <w:rPr>
+          <w:rFonts w:ascii="Segoe UI Emoji" w:hAnsi="Segoe UI Emoji" w:cs="Segoe UI Emoji"/>
+          <w:b/>
+          <w:bCs/>
+        </w:rPr>
+        <w:t>🛡️</w:t>
+      </w:r>
+      <w:r>
+        <w:rPr>
+          <w:rFonts w:ascii="Times New Roman" w:hAnsi="Times New Roman" w:cs="Times New Roman"/>
+          <w:b/>
+          <w:bCs/>
+        </w:rPr>
+        <w:t xml:space="preserve"> Duplicate SMS protection</w:t>
+      </w:r>
+    </w:p>
+    <w:p>
+      <w:pPr>
+        <w:rPr>
+          <w:rFonts w:ascii="Times New Roman" w:hAnsi="Times New Roman" w:cs="Times New Roman"/>
+        </w:rPr>
+      </w:pPr>
+      <w:r>
+        <w:rPr>
+          <w:rFonts w:ascii="Times New Roman" w:hAnsi="Times New Roman" w:cs="Times New Roman"/>
+        </w:rPr>
+        <w:t>This is also finalized:</w:t>
+      </w:r>
+    </w:p>
+    <w:p>
+      <w:pPr>
+        <w:rPr>
+          <w:rFonts w:ascii="Times New Roman" w:hAnsi="Times New Roman" w:cs="Times New Roman"/>
+        </w:rPr>
+      </w:pPr>
+      <w:r>
+        <w:rPr>
+          <w:rFonts w:ascii="Times New Roman" w:hAnsi="Times New Roman" w:cs="Times New Roman"/>
+        </w:rPr>
+        <w:t>Emergency Event created</w:t>
+      </w:r>
+    </w:p>
+    <w:p>
+      <w:pPr>
+        <w:rPr>
+          <w:rFonts w:ascii="Times New Roman" w:hAnsi="Times New Roman" w:cs="Times New Roman"/>
+        </w:rPr>
+      </w:pPr>
+      <w:r>
+        <w:rPr>
+          <w:rFonts w:ascii="Times New Roman" w:hAnsi="Times New Roman" w:cs="Times New Roman"/>
+        </w:rPr>
+        <w:t xml:space="preserve">        ↓</w:t>
+      </w:r>
+    </w:p>
+    <w:p>
+      <w:pPr>
+        <w:rPr>
+          <w:rFonts w:ascii="Times New Roman" w:hAnsi="Times New Roman" w:cs="Times New Roman"/>
+        </w:rPr>
+      </w:pPr>
+      <w:r>
+        <w:rPr>
+          <w:rFonts w:ascii="Times New Roman" w:hAnsi="Times New Roman" w:cs="Times New Roman"/>
+        </w:rPr>
+        <w:t>Already notified?</w:t>
+      </w:r>
+    </w:p>
+    <w:p>
+      <w:pPr>
+        <w:rPr>
+          <w:rFonts w:ascii="Times New Roman" w:hAnsi="Times New Roman" w:cs="Times New Roman"/>
+        </w:rPr>
+      </w:pPr>
+      <w:r>
+        <w:rPr>
+          <w:rFonts w:ascii="Times New Roman" w:hAnsi="Times New Roman" w:cs="Times New Roman"/>
+        </w:rPr>
+        <w:t xml:space="preserve">     /       \</w:t>
+      </w:r>
+    </w:p>
+    <w:p>
+      <w:pPr>
+        <w:rPr>
+          <w:rFonts w:ascii="Times New Roman" w:hAnsi="Times New Roman" w:cs="Times New Roman"/>
+        </w:rPr>
+      </w:pPr>
+      <w:r>
+        <w:rPr>
+          <w:rFonts w:ascii="Times New Roman" w:hAnsi="Times New Roman" w:cs="Times New Roman"/>
+        </w:rPr>
+        <w:t xml:space="preserve">   YES        NO</w:t>
+      </w:r>
+    </w:p>
+    <w:p>
+      <w:pPr>
+        <w:rPr>
+          <w:rFonts w:ascii="Times New Roman" w:hAnsi="Times New Roman" w:cs="Times New Roman"/>
+        </w:rPr>
+      </w:pPr>
+      <w:r>
+        <w:rPr>
+          <w:rFonts w:ascii="Times New Roman" w:hAnsi="Times New Roman" w:cs="Times New Roman"/>
+        </w:rPr>
+        <w:t xml:space="preserve">    ↓          ↓</w:t>
+      </w:r>
+    </w:p>
+    <w:p>
+      <w:pPr>
+        <w:rPr>
+          <w:rFonts w:ascii="Times New Roman" w:hAnsi="Times New Roman" w:cs="Times New Roman"/>
+        </w:rPr>
+      </w:pPr>
+      <w:r>
+        <w:rPr>
+          <w:rFonts w:ascii="Times New Roman" w:hAnsi="Times New Roman" w:cs="Times New Roman"/>
+        </w:rPr>
+        <w:t xml:space="preserve">  Ignore     Send SMS</w:t>
+      </w:r>
+    </w:p>
+    <w:p>
+      <w:pPr>
+        <w:rPr>
+          <w:rFonts w:ascii="Times New Roman" w:hAnsi="Times New Roman" w:cs="Times New Roman"/>
+        </w:rPr>
+      </w:pPr>
+      <w:r>
+        <w:rPr>
+          <w:rFonts w:ascii="Times New Roman" w:hAnsi="Times New Roman" w:cs="Times New Roman"/>
+        </w:rPr>
+        <w:t xml:space="preserve">             ↓</w:t>
+      </w:r>
+    </w:p>
+    <w:p>
+      <w:pPr>
+        <w:rPr>
+          <w:rFonts w:ascii="Times New Roman" w:hAnsi="Times New Roman" w:cs="Times New Roman"/>
+        </w:rPr>
+      </w:pPr>
+      <w:r>
+        <w:rPr>
+          <w:rFonts w:ascii="Times New Roman" w:hAnsi="Times New Roman" w:cs="Times New Roman"/>
+        </w:rPr>
+        <w:t xml:space="preserve">       Mark notified</w:t>
+      </w:r>
+    </w:p>
+    <w:p>
+      <w:pPr>
+        <w:rPr>
+          <w:rFonts w:ascii="Times New Roman" w:hAnsi="Times New Roman" w:cs="Times New Roman"/>
+        </w:rPr>
+      </w:pPr>
+      <w:proofErr w:type="gramStart"/>
+      <w:r>
+        <w:rPr>
+          <w:rFonts w:ascii="Times New Roman" w:hAnsi="Times New Roman" w:cs="Times New Roman"/>
+        </w:rPr>
+        <w:t>So</w:t>
+      </w:r>
+      <w:proofErr w:type="gramEnd"/>
+      <w:r>
+        <w:rPr>
+          <w:rFonts w:ascii="Times New Roman" w:hAnsi="Times New Roman" w:cs="Times New Roman"/>
+        </w:rPr>
+        <w:t xml:space="preserve"> if the ESP32 accidentally sends the same emergency event </w:t>
+      </w:r>
+      <w:r>
+        <w:rPr>
+          <w:rFonts w:ascii="Times New Roman" w:hAnsi="Times New Roman" w:cs="Times New Roman"/>
+          <w:b/>
+          <w:bCs/>
+        </w:rPr>
+        <w:t>5 times</w:t>
+      </w:r>
+      <w:r>
+        <w:rPr>
+          <w:rFonts w:ascii="Times New Roman" w:hAnsi="Times New Roman" w:cs="Times New Roman"/>
+        </w:rPr>
+        <w:t xml:space="preserve">, </w:t>
+      </w:r>
+      <w:proofErr w:type="spellStart"/>
+      <w:r>
+        <w:rPr>
+          <w:rFonts w:ascii="Times New Roman" w:hAnsi="Times New Roman" w:cs="Times New Roman"/>
+        </w:rPr>
+        <w:t>MedJarvis</w:t>
+      </w:r>
+      <w:proofErr w:type="spellEnd"/>
+      <w:r>
+        <w:rPr>
+          <w:rFonts w:ascii="Times New Roman" w:hAnsi="Times New Roman" w:cs="Times New Roman"/>
+        </w:rPr>
+        <w:t xml:space="preserve"> sends </w:t>
+      </w:r>
+      <w:r>
+        <w:rPr>
+          <w:rFonts w:ascii="Times New Roman" w:hAnsi="Times New Roman" w:cs="Times New Roman"/>
+          <w:b/>
+          <w:bCs/>
+        </w:rPr>
+        <w:t>only one SMS and one emergency call</w:t>
+      </w:r>
+      <w:r>
+        <w:rPr>
+          <w:rFonts w:ascii="Times New Roman" w:hAnsi="Times New Roman" w:cs="Times New Roman"/>
+        </w:rPr>
+        <w:t xml:space="preserve"> for that event.</w:t>
+      </w:r>
+    </w:p>
+    <w:p>
+      <w:pPr>
+        <w:rPr>
+          <w:rFonts w:ascii="Times New Roman" w:hAnsi="Times New Roman" w:cs="Times New Roman"/>
+        </w:rPr>
+      </w:pPr>
+      <w:r>
+        <w:rPr>
+          <w:rFonts w:ascii="Times New Roman" w:hAnsi="Times New Roman" w:cs="Times New Roman"/>
+        </w:rPr>
+        <w:t xml:space="preserve">We'll use a unique </w:t>
+      </w:r>
+      <w:r>
+        <w:rPr>
+          <w:rFonts w:ascii="Times New Roman" w:hAnsi="Times New Roman" w:cs="Times New Roman"/>
+          <w:b/>
+          <w:bCs/>
+        </w:rPr>
+        <w:t>Emergency Event ID</w:t>
+      </w:r>
+      <w:r>
+        <w:rPr>
+          <w:rFonts w:ascii="Times New Roman" w:hAnsi="Times New Roman" w:cs="Times New Roman"/>
+        </w:rPr>
+        <w:t xml:space="preserve"> as the key for this protection.</w:t>
+      </w:r>
+    </w:p>
+    <w:p>
+      <w:pPr>
+        <w:rPr>
+          <w:rFonts w:ascii="Times New Roman" w:hAnsi="Times New Roman" w:cs="Times New Roman"/>
+          <w:b/>
+          <w:bCs/>
+        </w:rPr>
+      </w:pPr>
+      <w:r>
+        <w:rPr>
+          <w:rFonts w:ascii="Times New Roman" w:hAnsi="Times New Roman" w:cs="Times New Roman"/>
+          <w:b/>
+          <w:bCs/>
+        </w:rPr>
+        <w:t>Final principle</w:t>
+      </w:r>
+    </w:p>
+    <w:p>
+      <w:pPr>
+        <w:rPr>
+          <w:rFonts w:ascii="Times New Roman" w:hAnsi="Times New Roman" w:cs="Times New Roman"/>
+        </w:rPr>
+      </w:pPr>
+      <w:r>
+        <w:rPr>
+          <w:rFonts w:ascii="Times New Roman" w:hAnsi="Times New Roman" w:cs="Times New Roman"/>
+          <w:b/>
+          <w:bCs/>
+        </w:rPr>
+        <w:t>Detect → Validate → Confirm → Notify → Call → Stay Active → Resolve</w:t>
+      </w:r>
+    </w:p>
+    <w:p>
+      <w:pPr>
+        <w:rPr>
+          <w:rFonts w:ascii="Times New Roman" w:hAnsi="Times New Roman" w:cs="Times New Roman"/>
+        </w:rPr>
+      </w:pPr>
+      <w:r>
+        <w:rPr>
+          <w:rFonts w:ascii="Times New Roman" w:hAnsi="Times New Roman" w:cs="Times New Roman"/>
+        </w:rPr>
+        <w:t>And importantly, we're keeping this intentionally simple rather than adding the old document's complex ambulance-priority routing. The updated implementation plan is the primary source for the final scope.</w:t>
+      </w:r>
+    </w:p>
+    <w:p>
+      <w:pPr>
+        <w:rPr>
+          <w:rFonts w:ascii="Times New Roman" w:hAnsi="Times New Roman" w:cs="Times New Roman"/>
+        </w:rPr>
+      </w:pPr>
     </w:p>
     <w:p>
       <w:pPr>
@@ -23093,6 +24189,155 @@
     </w:lvl>
   </w:abstractNum>
   <w:abstractNum w:abstractNumId="50" w15:restartNumberingAfterBreak="0">
+    <w:nsid w:val="51D34A3E"/>
+    <w:multiLevelType w:val="multilevel"/>
+    <w:tmpl w:val="0554CB90"/>
+    <w:lvl w:ilvl="0">
+      <w:start w:val="1"/>
+      <w:numFmt w:val="bullet"/>
+      <w:lvlText w:val=""/>
+      <w:lvlJc w:val="left"/>
+      <w:pPr>
+        <w:tabs>
+          <w:tab w:val="num" w:pos="720"/>
+        </w:tabs>
+        <w:ind w:left="720" w:hanging="360"/>
+      </w:pPr>
+      <w:rPr>
+        <w:rFonts w:ascii="Symbol" w:hAnsi="Symbol" w:hint="default"/>
+        <w:sz w:val="20"/>
+      </w:rPr>
+    </w:lvl>
+    <w:lvl w:ilvl="1" w:tentative="1">
+      <w:start w:val="1"/>
+      <w:numFmt w:val="bullet"/>
+      <w:lvlText w:val="o"/>
+      <w:lvlJc w:val="left"/>
+      <w:pPr>
+        <w:tabs>
+          <w:tab w:val="num" w:pos="1440"/>
+        </w:tabs>
+        <w:ind w:left="1440" w:hanging="360"/>
+      </w:pPr>
+      <w:rPr>
+        <w:rFonts w:ascii="Courier New" w:hAnsi="Courier New" w:hint="default"/>
+        <w:sz w:val="20"/>
+      </w:rPr>
+    </w:lvl>
+    <w:lvl w:ilvl="2" w:tentative="1">
+      <w:start w:val="1"/>
+      <w:numFmt w:val="bullet"/>
+      <w:lvlText w:val=""/>
+      <w:lvlJc w:val="left"/>
+      <w:pPr>
+        <w:tabs>
+          <w:tab w:val="num" w:pos="2160"/>
+        </w:tabs>
+        <w:ind w:left="2160" w:hanging="360"/>
+      </w:pPr>
+      <w:rPr>
+        <w:rFonts w:ascii="Wingdings" w:hAnsi="Wingdings" w:hint="default"/>
+        <w:sz w:val="20"/>
+      </w:rPr>
+    </w:lvl>
+    <w:lvl w:ilvl="3" w:tentative="1">
+      <w:start w:val="1"/>
+      <w:numFmt w:val="bullet"/>
+      <w:lvlText w:val=""/>
+      <w:lvlJc w:val="left"/>
+      <w:pPr>
+        <w:tabs>
+          <w:tab w:val="num" w:pos="2880"/>
+        </w:tabs>
+        <w:ind w:left="2880" w:hanging="360"/>
+      </w:pPr>
+      <w:rPr>
+        <w:rFonts w:ascii="Wingdings" w:hAnsi="Wingdings" w:hint="default"/>
+        <w:sz w:val="20"/>
+      </w:rPr>
+    </w:lvl>
+    <w:lvl w:ilvl="4" w:tentative="1">
+      <w:start w:val="1"/>
+      <w:numFmt w:val="bullet"/>
+      <w:lvlText w:val=""/>
+      <w:lvlJc w:val="left"/>
+      <w:pPr>
+        <w:tabs>
+          <w:tab w:val="num" w:pos="3600"/>
+        </w:tabs>
+        <w:ind w:left="3600" w:hanging="360"/>
+      </w:pPr>
+      <w:rPr>
+        <w:rFonts w:ascii="Wingdings" w:hAnsi="Wingdings" w:hint="default"/>
+        <w:sz w:val="20"/>
+      </w:rPr>
+    </w:lvl>
+    <w:lvl w:ilvl="5" w:tentative="1">
+      <w:start w:val="1"/>
+      <w:numFmt w:val="bullet"/>
+      <w:lvlText w:val=""/>
+      <w:lvlJc w:val="left"/>
+      <w:pPr>
+        <w:tabs>
+          <w:tab w:val="num" w:pos="4320"/>
+        </w:tabs>
+        <w:ind w:left="4320" w:hanging="360"/>
+      </w:pPr>
+      <w:rPr>
+        <w:rFonts w:ascii="Wingdings" w:hAnsi="Wingdings" w:hint="default"/>
+        <w:sz w:val="20"/>
+      </w:rPr>
+    </w:lvl>
+    <w:lvl w:ilvl="6" w:tentative="1">
+      <w:start w:val="1"/>
+      <w:numFmt w:val="bullet"/>
+      <w:lvlText w:val=""/>
+      <w:lvlJc w:val="left"/>
+      <w:pPr>
+        <w:tabs>
+          <w:tab w:val="num" w:pos="5040"/>
+        </w:tabs>
+        <w:ind w:left="5040" w:hanging="360"/>
+      </w:pPr>
+      <w:rPr>
+        <w:rFonts w:ascii="Wingdings" w:hAnsi="Wingdings" w:hint="default"/>
+        <w:sz w:val="20"/>
+      </w:rPr>
+    </w:lvl>
+    <w:lvl w:ilvl="7" w:tentative="1">
+      <w:start w:val="1"/>
+      <w:numFmt w:val="bullet"/>
+      <w:lvlText w:val=""/>
+      <w:lvlJc w:val="left"/>
+      <w:pPr>
+        <w:tabs>
+          <w:tab w:val="num" w:pos="5760"/>
+        </w:tabs>
+        <w:ind w:left="5760" w:hanging="360"/>
+      </w:pPr>
+      <w:rPr>
+        <w:rFonts w:ascii="Wingdings" w:hAnsi="Wingdings" w:hint="default"/>
+        <w:sz w:val="20"/>
+      </w:rPr>
+    </w:lvl>
+    <w:lvl w:ilvl="8" w:tentative="1">
+      <w:start w:val="1"/>
+      <w:numFmt w:val="bullet"/>
+      <w:lvlText w:val=""/>
+      <w:lvlJc w:val="left"/>
+      <w:pPr>
+        <w:tabs>
+          <w:tab w:val="num" w:pos="6480"/>
+        </w:tabs>
+        <w:ind w:left="6480" w:hanging="360"/>
+      </w:pPr>
+      <w:rPr>
+        <w:rFonts w:ascii="Wingdings" w:hAnsi="Wingdings" w:hint="default"/>
+        <w:sz w:val="20"/>
+      </w:rPr>
+    </w:lvl>
+  </w:abstractNum>
+  <w:abstractNum w:abstractNumId="51" w15:restartNumberingAfterBreak="0">
     <w:nsid w:val="52235B0B"/>
     <w:multiLevelType w:val="multilevel"/>
     <w:tmpl w:val="069CEAE4"/>
@@ -23241,7 +24486,7 @@
       </w:rPr>
     </w:lvl>
   </w:abstractNum>
-  <w:abstractNum w:abstractNumId="51" w15:restartNumberingAfterBreak="0">
+  <w:abstractNum w:abstractNumId="52" w15:restartNumberingAfterBreak="0">
     <w:nsid w:val="53B46DFE"/>
     <w:multiLevelType w:val="multilevel"/>
     <w:tmpl w:val="CF7C3E1C"/>
@@ -23390,7 +24635,7 @@
       </w:rPr>
     </w:lvl>
   </w:abstractNum>
-  <w:abstractNum w:abstractNumId="52" w15:restartNumberingAfterBreak="0">
+  <w:abstractNum w:abstractNumId="53" w15:restartNumberingAfterBreak="0">
     <w:nsid w:val="55BC4CF6"/>
     <w:multiLevelType w:val="multilevel"/>
     <w:tmpl w:val="7C066A70"/>
@@ -23539,7 +24784,7 @@
       </w:rPr>
     </w:lvl>
   </w:abstractNum>
-  <w:abstractNum w:abstractNumId="53" w15:restartNumberingAfterBreak="0">
+  <w:abstractNum w:abstractNumId="54" w15:restartNumberingAfterBreak="0">
     <w:nsid w:val="57553098"/>
     <w:multiLevelType w:val="multilevel"/>
     <w:tmpl w:val="F1DC32CE"/>
@@ -23688,7 +24933,7 @@
       </w:rPr>
     </w:lvl>
   </w:abstractNum>
-  <w:abstractNum w:abstractNumId="54" w15:restartNumberingAfterBreak="0">
+  <w:abstractNum w:abstractNumId="55" w15:restartNumberingAfterBreak="0">
     <w:nsid w:val="5A512CE9"/>
     <w:multiLevelType w:val="multilevel"/>
     <w:tmpl w:val="55589C44"/>
@@ -23837,7 +25082,7 @@
       </w:rPr>
     </w:lvl>
   </w:abstractNum>
-  <w:abstractNum w:abstractNumId="55" w15:restartNumberingAfterBreak="0">
+  <w:abstractNum w:abstractNumId="56" w15:restartNumberingAfterBreak="0">
     <w:nsid w:val="5AE723CF"/>
     <w:multiLevelType w:val="multilevel"/>
     <w:tmpl w:val="CFFE01AA"/>
@@ -23986,7 +25231,7 @@
       </w:rPr>
     </w:lvl>
   </w:abstractNum>
-  <w:abstractNum w:abstractNumId="56" w15:restartNumberingAfterBreak="0">
+  <w:abstractNum w:abstractNumId="57" w15:restartNumberingAfterBreak="0">
     <w:nsid w:val="5EDF64C4"/>
     <w:multiLevelType w:val="multilevel"/>
     <w:tmpl w:val="DD885B68"/>
@@ -24135,7 +25380,7 @@
       </w:rPr>
     </w:lvl>
   </w:abstractNum>
-  <w:abstractNum w:abstractNumId="57" w15:restartNumberingAfterBreak="0">
+  <w:abstractNum w:abstractNumId="58" w15:restartNumberingAfterBreak="0">
     <w:nsid w:val="5F7C5282"/>
     <w:multiLevelType w:val="multilevel"/>
     <w:tmpl w:val="3E7EE4F2"/>
@@ -24284,7 +25529,7 @@
       </w:rPr>
     </w:lvl>
   </w:abstractNum>
-  <w:abstractNum w:abstractNumId="58" w15:restartNumberingAfterBreak="0">
+  <w:abstractNum w:abstractNumId="59" w15:restartNumberingAfterBreak="0">
     <w:nsid w:val="61EA2C17"/>
     <w:multiLevelType w:val="multilevel"/>
     <w:tmpl w:val="6144D528"/>
@@ -24433,7 +25678,7 @@
       </w:rPr>
     </w:lvl>
   </w:abstractNum>
-  <w:abstractNum w:abstractNumId="59" w15:restartNumberingAfterBreak="0">
+  <w:abstractNum w:abstractNumId="60" w15:restartNumberingAfterBreak="0">
     <w:nsid w:val="686F4132"/>
     <w:multiLevelType w:val="multilevel"/>
     <w:tmpl w:val="D26033B2"/>
@@ -24582,7 +25827,7 @@
       </w:rPr>
     </w:lvl>
   </w:abstractNum>
-  <w:abstractNum w:abstractNumId="60" w15:restartNumberingAfterBreak="0">
+  <w:abstractNum w:abstractNumId="61" w15:restartNumberingAfterBreak="0">
     <w:nsid w:val="689032D2"/>
     <w:multiLevelType w:val="multilevel"/>
     <w:tmpl w:val="A5729E68"/>
@@ -24731,7 +25976,156 @@
       </w:rPr>
     </w:lvl>
   </w:abstractNum>
-  <w:abstractNum w:abstractNumId="61" w15:restartNumberingAfterBreak="0">
+  <w:abstractNum w:abstractNumId="62" w15:restartNumberingAfterBreak="0">
+    <w:nsid w:val="6AB85157"/>
+    <w:multiLevelType w:val="multilevel"/>
+    <w:tmpl w:val="8E6AF052"/>
+    <w:lvl w:ilvl="0">
+      <w:start w:val="1"/>
+      <w:numFmt w:val="bullet"/>
+      <w:lvlText w:val=""/>
+      <w:lvlJc w:val="left"/>
+      <w:pPr>
+        <w:tabs>
+          <w:tab w:val="num" w:pos="720"/>
+        </w:tabs>
+        <w:ind w:left="720" w:hanging="360"/>
+      </w:pPr>
+      <w:rPr>
+        <w:rFonts w:ascii="Symbol" w:hAnsi="Symbol" w:hint="default"/>
+        <w:sz w:val="20"/>
+      </w:rPr>
+    </w:lvl>
+    <w:lvl w:ilvl="1" w:tentative="1">
+      <w:start w:val="1"/>
+      <w:numFmt w:val="bullet"/>
+      <w:lvlText w:val="o"/>
+      <w:lvlJc w:val="left"/>
+      <w:pPr>
+        <w:tabs>
+          <w:tab w:val="num" w:pos="1440"/>
+        </w:tabs>
+        <w:ind w:left="1440" w:hanging="360"/>
+      </w:pPr>
+      <w:rPr>
+        <w:rFonts w:ascii="Courier New" w:hAnsi="Courier New" w:hint="default"/>
+        <w:sz w:val="20"/>
+      </w:rPr>
+    </w:lvl>
+    <w:lvl w:ilvl="2" w:tentative="1">
+      <w:start w:val="1"/>
+      <w:numFmt w:val="bullet"/>
+      <w:lvlText w:val=""/>
+      <w:lvlJc w:val="left"/>
+      <w:pPr>
+        <w:tabs>
+          <w:tab w:val="num" w:pos="2160"/>
+        </w:tabs>
+        <w:ind w:left="2160" w:hanging="360"/>
+      </w:pPr>
+      <w:rPr>
+        <w:rFonts w:ascii="Wingdings" w:hAnsi="Wingdings" w:hint="default"/>
+        <w:sz w:val="20"/>
+      </w:rPr>
+    </w:lvl>
+    <w:lvl w:ilvl="3" w:tentative="1">
+      <w:start w:val="1"/>
+      <w:numFmt w:val="bullet"/>
+      <w:lvlText w:val=""/>
+      <w:lvlJc w:val="left"/>
+      <w:pPr>
+        <w:tabs>
+          <w:tab w:val="num" w:pos="2880"/>
+        </w:tabs>
+        <w:ind w:left="2880" w:hanging="360"/>
+      </w:pPr>
+      <w:rPr>
+        <w:rFonts w:ascii="Wingdings" w:hAnsi="Wingdings" w:hint="default"/>
+        <w:sz w:val="20"/>
+      </w:rPr>
+    </w:lvl>
+    <w:lvl w:ilvl="4" w:tentative="1">
+      <w:start w:val="1"/>
+      <w:numFmt w:val="bullet"/>
+      <w:lvlText w:val=""/>
+      <w:lvlJc w:val="left"/>
+      <w:pPr>
+        <w:tabs>
+          <w:tab w:val="num" w:pos="3600"/>
+        </w:tabs>
+        <w:ind w:left="3600" w:hanging="360"/>
+      </w:pPr>
+      <w:rPr>
+        <w:rFonts w:ascii="Wingdings" w:hAnsi="Wingdings" w:hint="default"/>
+        <w:sz w:val="20"/>
+      </w:rPr>
+    </w:lvl>
+    <w:lvl w:ilvl="5" w:tentative="1">
+      <w:start w:val="1"/>
+      <w:numFmt w:val="bullet"/>
+      <w:lvlText w:val=""/>
+      <w:lvlJc w:val="left"/>
+      <w:pPr>
+        <w:tabs>
+          <w:tab w:val="num" w:pos="4320"/>
+        </w:tabs>
+        <w:ind w:left="4320" w:hanging="360"/>
+      </w:pPr>
+      <w:rPr>
+        <w:rFonts w:ascii="Wingdings" w:hAnsi="Wingdings" w:hint="default"/>
+        <w:sz w:val="20"/>
+      </w:rPr>
+    </w:lvl>
+    <w:lvl w:ilvl="6" w:tentative="1">
+      <w:start w:val="1"/>
+      <w:numFmt w:val="bullet"/>
+      <w:lvlText w:val=""/>
+      <w:lvlJc w:val="left"/>
+      <w:pPr>
+        <w:tabs>
+          <w:tab w:val="num" w:pos="5040"/>
+        </w:tabs>
+        <w:ind w:left="5040" w:hanging="360"/>
+      </w:pPr>
+      <w:rPr>
+        <w:rFonts w:ascii="Wingdings" w:hAnsi="Wingdings" w:hint="default"/>
+        <w:sz w:val="20"/>
+      </w:rPr>
+    </w:lvl>
+    <w:lvl w:ilvl="7" w:tentative="1">
+      <w:start w:val="1"/>
+      <w:numFmt w:val="bullet"/>
+      <w:lvlText w:val=""/>
+      <w:lvlJc w:val="left"/>
+      <w:pPr>
+        <w:tabs>
+          <w:tab w:val="num" w:pos="5760"/>
+        </w:tabs>
+        <w:ind w:left="5760" w:hanging="360"/>
+      </w:pPr>
+      <w:rPr>
+        <w:rFonts w:ascii="Wingdings" w:hAnsi="Wingdings" w:hint="default"/>
+        <w:sz w:val="20"/>
+      </w:rPr>
+    </w:lvl>
+    <w:lvl w:ilvl="8" w:tentative="1">
+      <w:start w:val="1"/>
+      <w:numFmt w:val="bullet"/>
+      <w:lvlText w:val=""/>
+      <w:lvlJc w:val="left"/>
+      <w:pPr>
+        <w:tabs>
+          <w:tab w:val="num" w:pos="6480"/>
+        </w:tabs>
+        <w:ind w:left="6480" w:hanging="360"/>
+      </w:pPr>
+      <w:rPr>
+        <w:rFonts w:ascii="Wingdings" w:hAnsi="Wingdings" w:hint="default"/>
+        <w:sz w:val="20"/>
+      </w:rPr>
+    </w:lvl>
+  </w:abstractNum>
+  <w:abstractNum w:abstractNumId="63" w15:restartNumberingAfterBreak="0">
     <w:nsid w:val="6D7E41B9"/>
     <w:multiLevelType w:val="multilevel"/>
     <w:tmpl w:val="3E22131C"/>
@@ -24844,7 +26238,7 @@
       </w:pPr>
     </w:lvl>
   </w:abstractNum>
-  <w:abstractNum w:abstractNumId="62" w15:restartNumberingAfterBreak="0">
+  <w:abstractNum w:abstractNumId="64" w15:restartNumberingAfterBreak="0">
     <w:nsid w:val="6F4D3F14"/>
     <w:multiLevelType w:val="multilevel"/>
     <w:tmpl w:val="50785AD0"/>
@@ -24993,7 +26387,7 @@
       </w:rPr>
     </w:lvl>
   </w:abstractNum>
-  <w:abstractNum w:abstractNumId="63" w15:restartNumberingAfterBreak="0">
+  <w:abstractNum w:abstractNumId="65" w15:restartNumberingAfterBreak="0">
     <w:nsid w:val="6FAF5592"/>
     <w:multiLevelType w:val="multilevel"/>
     <w:tmpl w:val="FEA6C906"/>
@@ -25106,7 +26500,156 @@
       </w:pPr>
     </w:lvl>
   </w:abstractNum>
-  <w:abstractNum w:abstractNumId="64" w15:restartNumberingAfterBreak="0">
+  <w:abstractNum w:abstractNumId="66" w15:restartNumberingAfterBreak="0">
+    <w:nsid w:val="755A4E52"/>
+    <w:multiLevelType w:val="multilevel"/>
+    <w:tmpl w:val="C9B486B8"/>
+    <w:lvl w:ilvl="0">
+      <w:start w:val="1"/>
+      <w:numFmt w:val="bullet"/>
+      <w:lvlText w:val=""/>
+      <w:lvlJc w:val="left"/>
+      <w:pPr>
+        <w:tabs>
+          <w:tab w:val="num" w:pos="720"/>
+        </w:tabs>
+        <w:ind w:left="720" w:hanging="360"/>
+      </w:pPr>
+      <w:rPr>
+        <w:rFonts w:ascii="Symbol" w:hAnsi="Symbol" w:hint="default"/>
+        <w:sz w:val="20"/>
+      </w:rPr>
+    </w:lvl>
+    <w:lvl w:ilvl="1" w:tentative="1">
+      <w:start w:val="1"/>
+      <w:numFmt w:val="bullet"/>
+      <w:lvlText w:val="o"/>
+      <w:lvlJc w:val="left"/>
+      <w:pPr>
+        <w:tabs>
+          <w:tab w:val="num" w:pos="1440"/>
+        </w:tabs>
+        <w:ind w:left="1440" w:hanging="360"/>
+      </w:pPr>
+      <w:rPr>
+        <w:rFonts w:ascii="Courier New" w:hAnsi="Courier New" w:hint="default"/>
+        <w:sz w:val="20"/>
+      </w:rPr>
+    </w:lvl>
+    <w:lvl w:ilvl="2" w:tentative="1">
+      <w:start w:val="1"/>
+      <w:numFmt w:val="bullet"/>
+      <w:lvlText w:val=""/>
+      <w:lvlJc w:val="left"/>
+      <w:pPr>
+        <w:tabs>
+          <w:tab w:val="num" w:pos="2160"/>
+        </w:tabs>
+        <w:ind w:left="2160" w:hanging="360"/>
+      </w:pPr>
+      <w:rPr>
+        <w:rFonts w:ascii="Wingdings" w:hAnsi="Wingdings" w:hint="default"/>
+        <w:sz w:val="20"/>
+      </w:rPr>
+    </w:lvl>
+    <w:lvl w:ilvl="3" w:tentative="1">
+      <w:start w:val="1"/>
+      <w:numFmt w:val="bullet"/>
+      <w:lvlText w:val=""/>
+      <w:lvlJc w:val="left"/>
+      <w:pPr>
+        <w:tabs>
+          <w:tab w:val="num" w:pos="2880"/>
+        </w:tabs>
+        <w:ind w:left="2880" w:hanging="360"/>
+      </w:pPr>
+      <w:rPr>
+        <w:rFonts w:ascii="Wingdings" w:hAnsi="Wingdings" w:hint="default"/>
+        <w:sz w:val="20"/>
+      </w:rPr>
+    </w:lvl>
+    <w:lvl w:ilvl="4" w:tentative="1">
+      <w:start w:val="1"/>
+      <w:numFmt w:val="bullet"/>
+      <w:lvlText w:val=""/>
+      <w:lvlJc w:val="left"/>
+      <w:pPr>
+        <w:tabs>
+          <w:tab w:val="num" w:pos="3600"/>
+        </w:tabs>
+        <w:ind w:left="3600" w:hanging="360"/>
+      </w:pPr>
+      <w:rPr>
+        <w:rFonts w:ascii="Wingdings" w:hAnsi="Wingdings" w:hint="default"/>
+        <w:sz w:val="20"/>
+      </w:rPr>
+    </w:lvl>
+    <w:lvl w:ilvl="5" w:tentative="1">
+      <w:start w:val="1"/>
+      <w:numFmt w:val="bullet"/>
+      <w:lvlText w:val=""/>
+      <w:lvlJc w:val="left"/>
+      <w:pPr>
+        <w:tabs>
+          <w:tab w:val="num" w:pos="4320"/>
+        </w:tabs>
+        <w:ind w:left="4320" w:hanging="360"/>
+      </w:pPr>
+      <w:rPr>
+        <w:rFonts w:ascii="Wingdings" w:hAnsi="Wingdings" w:hint="default"/>
+        <w:sz w:val="20"/>
+      </w:rPr>
+    </w:lvl>
+    <w:lvl w:ilvl="6" w:tentative="1">
+      <w:start w:val="1"/>
+      <w:numFmt w:val="bullet"/>
+      <w:lvlText w:val=""/>
+      <w:lvlJc w:val="left"/>
+      <w:pPr>
+        <w:tabs>
+          <w:tab w:val="num" w:pos="5040"/>
+        </w:tabs>
+        <w:ind w:left="5040" w:hanging="360"/>
+      </w:pPr>
+      <w:rPr>
+        <w:rFonts w:ascii="Wingdings" w:hAnsi="Wingdings" w:hint="default"/>
+        <w:sz w:val="20"/>
+      </w:rPr>
+    </w:lvl>
+    <w:lvl w:ilvl="7" w:tentative="1">
+      <w:start w:val="1"/>
+      <w:numFmt w:val="bullet"/>
+      <w:lvlText w:val=""/>
+      <w:lvlJc w:val="left"/>
+      <w:pPr>
+        <w:tabs>
+          <w:tab w:val="num" w:pos="5760"/>
+        </w:tabs>
+        <w:ind w:left="5760" w:hanging="360"/>
+      </w:pPr>
+      <w:rPr>
+        <w:rFonts w:ascii="Wingdings" w:hAnsi="Wingdings" w:hint="default"/>
+        <w:sz w:val="20"/>
+      </w:rPr>
+    </w:lvl>
+    <w:lvl w:ilvl="8" w:tentative="1">
+      <w:start w:val="1"/>
+      <w:numFmt w:val="bullet"/>
+      <w:lvlText w:val=""/>
+      <w:lvlJc w:val="left"/>
+      <w:pPr>
+        <w:tabs>
+          <w:tab w:val="num" w:pos="6480"/>
+        </w:tabs>
+        <w:ind w:left="6480" w:hanging="360"/>
+      </w:pPr>
+      <w:rPr>
+        <w:rFonts w:ascii="Wingdings" w:hAnsi="Wingdings" w:hint="default"/>
+        <w:sz w:val="20"/>
+      </w:rPr>
+    </w:lvl>
+  </w:abstractNum>
+  <w:abstractNum w:abstractNumId="67" w15:restartNumberingAfterBreak="0">
     <w:nsid w:val="7F536FEC"/>
     <w:multiLevelType w:val="multilevel"/>
     <w:tmpl w:val="EC980A46"/>
@@ -25255,7 +26798,7 @@
       </w:rPr>
     </w:lvl>
   </w:abstractNum>
-  <w:abstractNum w:abstractNumId="65" w15:restartNumberingAfterBreak="0">
+  <w:abstractNum w:abstractNumId="68" w15:restartNumberingAfterBreak="0">
     <w:nsid w:val="7FC73E6B"/>
     <w:multiLevelType w:val="multilevel"/>
     <w:tmpl w:val="7ED05074"/>
@@ -25432,7 +26975,7 @@
     <w:abstractNumId w:val="26"/>
   </w:num>
   <w:num w:numId="10" w16cid:durableId="1547836211">
-    <w:abstractNumId w:val="52"/>
+    <w:abstractNumId w:val="53"/>
   </w:num>
   <w:num w:numId="11" w16cid:durableId="604919167">
     <w:abstractNumId w:val="27"/>
@@ -25447,7 +26990,7 @@
     <w:abstractNumId w:val="11"/>
   </w:num>
   <w:num w:numId="15" w16cid:durableId="1280405935">
-    <w:abstractNumId w:val="61"/>
+    <w:abstractNumId w:val="63"/>
   </w:num>
   <w:num w:numId="16" w16cid:durableId="1085955346">
     <w:abstractNumId w:val="22"/>
@@ -25459,16 +27002,16 @@
     <w:abstractNumId w:val="30"/>
   </w:num>
   <w:num w:numId="19" w16cid:durableId="1552691377">
-    <w:abstractNumId w:val="59"/>
+    <w:abstractNumId w:val="60"/>
   </w:num>
   <w:num w:numId="20" w16cid:durableId="1250623973">
     <w:abstractNumId w:val="39"/>
   </w:num>
   <w:num w:numId="21" w16cid:durableId="724335817">
-    <w:abstractNumId w:val="54"/>
+    <w:abstractNumId w:val="55"/>
   </w:num>
   <w:num w:numId="22" w16cid:durableId="1274362263">
-    <w:abstractNumId w:val="63"/>
+    <w:abstractNumId w:val="65"/>
   </w:num>
   <w:num w:numId="23" w16cid:durableId="237372015">
     <w:abstractNumId w:val="15"/>
@@ -25480,7 +27023,7 @@
     <w:abstractNumId w:val="46"/>
   </w:num>
   <w:num w:numId="26" w16cid:durableId="140578980">
-    <w:abstractNumId w:val="51"/>
+    <w:abstractNumId w:val="52"/>
   </w:num>
   <w:num w:numId="27" w16cid:durableId="481891662">
     <w:abstractNumId w:val="6"/>
@@ -25525,7 +27068,7 @@
     <w:abstractNumId w:val="18"/>
   </w:num>
   <w:num w:numId="41" w16cid:durableId="1935819655">
-    <w:abstractNumId w:val="58"/>
+    <w:abstractNumId w:val="59"/>
   </w:num>
   <w:num w:numId="42" w16cid:durableId="2084251917">
     <w:abstractNumId w:val="44"/>
@@ -25534,19 +27077,19 @@
     <w:abstractNumId w:val="0"/>
   </w:num>
   <w:num w:numId="44" w16cid:durableId="49615891">
-    <w:abstractNumId w:val="65"/>
+    <w:abstractNumId w:val="68"/>
   </w:num>
   <w:num w:numId="45" w16cid:durableId="925454710">
-    <w:abstractNumId w:val="53"/>
+    <w:abstractNumId w:val="54"/>
   </w:num>
   <w:num w:numId="46" w16cid:durableId="239800488">
-    <w:abstractNumId w:val="55"/>
+    <w:abstractNumId w:val="56"/>
   </w:num>
   <w:num w:numId="47" w16cid:durableId="642344998">
     <w:abstractNumId w:val="24"/>
   </w:num>
   <w:num w:numId="48" w16cid:durableId="1872257735">
-    <w:abstractNumId w:val="50"/>
+    <w:abstractNumId w:val="51"/>
   </w:num>
   <w:num w:numId="49" w16cid:durableId="1170634020">
     <w:abstractNumId w:val="25"/>
@@ -25558,7 +27101,7 @@
     <w:abstractNumId w:val="28"/>
   </w:num>
   <w:num w:numId="52" w16cid:durableId="1222670998">
-    <w:abstractNumId w:val="64"/>
+    <w:abstractNumId w:val="67"/>
   </w:num>
   <w:num w:numId="53" w16cid:durableId="1553881107">
     <w:abstractNumId w:val="32"/>
@@ -25567,7 +27110,7 @@
     <w:abstractNumId w:val="9"/>
   </w:num>
   <w:num w:numId="55" w16cid:durableId="341249606">
-    <w:abstractNumId w:val="56"/>
+    <w:abstractNumId w:val="57"/>
   </w:num>
   <w:num w:numId="56" w16cid:durableId="1412507180">
     <w:abstractNumId w:val="47"/>
@@ -25582,16 +27125,16 @@
     <w:abstractNumId w:val="42"/>
   </w:num>
   <w:num w:numId="60" w16cid:durableId="1278370478">
-    <w:abstractNumId w:val="57"/>
+    <w:abstractNumId w:val="58"/>
   </w:num>
   <w:num w:numId="61" w16cid:durableId="1021665156">
-    <w:abstractNumId w:val="60"/>
+    <w:abstractNumId w:val="61"/>
   </w:num>
   <w:num w:numId="62" w16cid:durableId="1480730635">
     <w:abstractNumId w:val="7"/>
   </w:num>
   <w:num w:numId="63" w16cid:durableId="510687523">
-    <w:abstractNumId w:val="62"/>
+    <w:abstractNumId w:val="64"/>
   </w:num>
   <w:num w:numId="64" w16cid:durableId="1679236228">
     <w:abstractNumId w:val="3"/>
@@ -25601,6 +27144,15 @@
   </w:num>
   <w:num w:numId="66" w16cid:durableId="70125516">
     <w:abstractNumId w:val="2"/>
+  </w:num>
+  <w:num w:numId="67" w16cid:durableId="1759329923">
+    <w:abstractNumId w:val="66"/>
+  </w:num>
+  <w:num w:numId="68" w16cid:durableId="109785713">
+    <w:abstractNumId w:val="62"/>
+  </w:num>
+  <w:num w:numId="69" w16cid:durableId="1682390418">
+    <w:abstractNumId w:val="50"/>
   </w:num>
   <w:numIdMacAtCleanup w:val="66"/>
 </w:numbering>

</xml_diff>